<commit_message>
feat: Implement illegal parking detection with an architectural refactor into manager modules, add new documentation.
</commit_message>
<xml_diff>
--- a/docs/image_processing.docx
+++ b/docs/image_processing.docx
@@ -10,17 +10,17 @@
           <w:rFonts w:ascii="Times New Roman" w:eastAsia="Times New Roman" w:hAnsi="Times New Roman" w:cs="Times New Roman"/>
           <w:b/>
           <w:bCs/>
-          <w:sz w:val="27"/>
-          <w:szCs w:val="27"/>
-        </w:rPr>
-      </w:pPr>
-      <w:r>
-        <w:rPr>
-          <w:rFonts w:ascii="Times New Roman" w:eastAsia="Times New Roman" w:hAnsi="Times New Roman" w:cs="Times New Roman"/>
-          <w:b/>
-          <w:bCs/>
-          <w:sz w:val="27"/>
-          <w:szCs w:val="27"/>
+          <w:sz w:val="26"/>
+          <w:szCs w:val="26"/>
+        </w:rPr>
+      </w:pPr>
+      <w:r>
+        <w:rPr>
+          <w:rFonts w:ascii="Times New Roman" w:eastAsia="Times New Roman" w:hAnsi="Times New Roman" w:cs="Times New Roman"/>
+          <w:b/>
+          <w:bCs/>
+          <w:sz w:val="26"/>
+          <w:szCs w:val="26"/>
         </w:rPr>
         <w:t>Chương X: Các Kỹ Thuật Tiền Xử Lý Ảnh Biển Số</w:t>
       </w:r>
@@ -30,15 +30,15 @@
         <w:spacing w:before="100" w:beforeAutospacing="1" w:after="100" w:afterAutospacing="1" w:line="240" w:lineRule="auto"/>
         <w:rPr>
           <w:rFonts w:ascii="Times New Roman" w:eastAsia="Times New Roman" w:hAnsi="Times New Roman" w:cs="Times New Roman"/>
-          <w:sz w:val="24"/>
-          <w:szCs w:val="24"/>
-        </w:rPr>
-      </w:pPr>
-      <w:r>
-        <w:rPr>
-          <w:rFonts w:ascii="Times New Roman" w:eastAsia="Times New Roman" w:hAnsi="Times New Roman" w:cs="Times New Roman"/>
-          <w:sz w:val="24"/>
-          <w:szCs w:val="24"/>
+          <w:sz w:val="26"/>
+          <w:szCs w:val="26"/>
+        </w:rPr>
+      </w:pPr>
+      <w:r>
+        <w:rPr>
+          <w:rFonts w:ascii="Times New Roman" w:eastAsia="Times New Roman" w:hAnsi="Times New Roman" w:cs="Times New Roman"/>
+          <w:sz w:val="26"/>
+          <w:szCs w:val="26"/>
         </w:rPr>
         <w:t>Ảnh biển số được cắt (crop) từ bounding box của YOLO thường có kích thước nhỏ, độ phân giải thấp, bị méo góc do phối cảnh camera và chịu ảnh hưởng mạnh bởi điều kiện ánh sáng môi trường (lóa sáng, bóng râm). Do đó, trước khi đưa vào mô hình nhận dạng ký tự quang học (PaddleOCR), hệ thống áp dụng một chuỗi các kỹ thuật tiền xử lý (Preprocessing Pipeline) nhằm tối ưu hóa chất lượng ảnh, bao gồm:</w:t>
       </w:r>
@@ -51,17 +51,17 @@
           <w:rFonts w:ascii="Times New Roman" w:eastAsia="Times New Roman" w:hAnsi="Times New Roman" w:cs="Times New Roman"/>
           <w:b/>
           <w:bCs/>
-          <w:sz w:val="24"/>
-          <w:szCs w:val="24"/>
-        </w:rPr>
-      </w:pPr>
-      <w:r>
-        <w:rPr>
-          <w:rFonts w:ascii="Times New Roman" w:eastAsia="Times New Roman" w:hAnsi="Times New Roman" w:cs="Times New Roman"/>
-          <w:b/>
-          <w:bCs/>
-          <w:sz w:val="24"/>
-          <w:szCs w:val="24"/>
+          <w:sz w:val="26"/>
+          <w:szCs w:val="26"/>
+        </w:rPr>
+      </w:pPr>
+      <w:r>
+        <w:rPr>
+          <w:rFonts w:ascii="Times New Roman" w:eastAsia="Times New Roman" w:hAnsi="Times New Roman" w:cs="Times New Roman"/>
+          <w:b/>
+          <w:bCs/>
+          <w:sz w:val="26"/>
+          <w:szCs w:val="26"/>
         </w:rPr>
         <w:t>1. Biến đổi phối cảnh (Perspective Transformation)</w:t>
       </w:r>
@@ -75,25 +75,25 @@
         <w:spacing w:before="100" w:beforeAutospacing="1" w:after="100" w:afterAutospacing="1" w:line="240" w:lineRule="auto"/>
         <w:rPr>
           <w:rFonts w:ascii="Times New Roman" w:eastAsia="Times New Roman" w:hAnsi="Times New Roman" w:cs="Times New Roman"/>
-          <w:sz w:val="24"/>
-          <w:szCs w:val="24"/>
-        </w:rPr>
-      </w:pPr>
-      <w:r>
-        <w:rPr>
-          <w:rFonts w:ascii="Times New Roman" w:eastAsia="Times New Roman" w:hAnsi="Times New Roman" w:cs="Times New Roman"/>
-          <w:b/>
-          <w:bCs/>
-          <w:sz w:val="24"/>
-          <w:szCs w:val="24"/>
+          <w:sz w:val="26"/>
+          <w:szCs w:val="26"/>
+        </w:rPr>
+      </w:pPr>
+      <w:r>
+        <w:rPr>
+          <w:rFonts w:ascii="Times New Roman" w:eastAsia="Times New Roman" w:hAnsi="Times New Roman" w:cs="Times New Roman"/>
+          <w:b/>
+          <w:bCs/>
+          <w:sz w:val="26"/>
+          <w:szCs w:val="26"/>
         </w:rPr>
         <w:t>Vấn đề:</w:t>
       </w:r>
       <w:r>
         <w:rPr>
           <w:rFonts w:ascii="Times New Roman" w:eastAsia="Times New Roman" w:hAnsi="Times New Roman" w:cs="Times New Roman"/>
-          <w:sz w:val="24"/>
-          <w:szCs w:val="24"/>
+          <w:sz w:val="26"/>
+          <w:szCs w:val="26"/>
         </w:rPr>
         <w:t xml:space="preserve"> Camera </w:t>
       </w:r>
@@ -101,8 +101,8 @@
       <w:r>
         <w:rPr>
           <w:rFonts w:ascii="Times New Roman" w:eastAsia="Times New Roman" w:hAnsi="Times New Roman" w:cs="Times New Roman"/>
-          <w:sz w:val="24"/>
-          <w:szCs w:val="24"/>
+          <w:sz w:val="26"/>
+          <w:szCs w:val="26"/>
         </w:rPr>
         <w:t>an</w:t>
       </w:r>
@@ -110,8 +110,8 @@
       <w:r>
         <w:rPr>
           <w:rFonts w:ascii="Times New Roman" w:eastAsia="Times New Roman" w:hAnsi="Times New Roman" w:cs="Times New Roman"/>
-          <w:sz w:val="24"/>
-          <w:szCs w:val="24"/>
+          <w:sz w:val="26"/>
+          <w:szCs w:val="26"/>
         </w:rPr>
         <w:t xml:space="preserve"> ninh thường được lắp đặt trên cao và nhìn chéo xuống, khiến biển số xe thu được có dạng hình thang hoặc đa giác méo thay vì hình chữ nhật chuẩn. Điều này làm giảm độ chính xác của OCR khi quét các dòng chữ.</w:t>
       </w:r>
@@ -125,17 +125,17 @@
         <w:spacing w:before="100" w:beforeAutospacing="1" w:after="100" w:afterAutospacing="1" w:line="240" w:lineRule="auto"/>
         <w:rPr>
           <w:rFonts w:ascii="Times New Roman" w:eastAsia="Times New Roman" w:hAnsi="Times New Roman" w:cs="Times New Roman"/>
-          <w:sz w:val="24"/>
-          <w:szCs w:val="24"/>
-        </w:rPr>
-      </w:pPr>
-      <w:r>
-        <w:rPr>
-          <w:rFonts w:ascii="Times New Roman" w:eastAsia="Times New Roman" w:hAnsi="Times New Roman" w:cs="Times New Roman"/>
-          <w:b/>
-          <w:bCs/>
-          <w:sz w:val="24"/>
-          <w:szCs w:val="24"/>
+          <w:sz w:val="26"/>
+          <w:szCs w:val="26"/>
+        </w:rPr>
+      </w:pPr>
+      <w:r>
+        <w:rPr>
+          <w:rFonts w:ascii="Times New Roman" w:eastAsia="Times New Roman" w:hAnsi="Times New Roman" w:cs="Times New Roman"/>
+          <w:b/>
+          <w:bCs/>
+          <w:sz w:val="26"/>
+          <w:szCs w:val="26"/>
         </w:rPr>
         <w:t>Giải pháp:</w:t>
       </w:r>
@@ -149,15 +149,15 @@
         <w:spacing w:before="100" w:beforeAutospacing="1" w:after="100" w:afterAutospacing="1" w:line="240" w:lineRule="auto"/>
         <w:rPr>
           <w:rFonts w:ascii="Times New Roman" w:eastAsia="Times New Roman" w:hAnsi="Times New Roman" w:cs="Times New Roman"/>
-          <w:sz w:val="24"/>
-          <w:szCs w:val="24"/>
-        </w:rPr>
-      </w:pPr>
-      <w:r>
-        <w:rPr>
-          <w:rFonts w:ascii="Times New Roman" w:eastAsia="Times New Roman" w:hAnsi="Times New Roman" w:cs="Times New Roman"/>
-          <w:sz w:val="24"/>
-          <w:szCs w:val="24"/>
+          <w:sz w:val="26"/>
+          <w:szCs w:val="26"/>
+        </w:rPr>
+      </w:pPr>
+      <w:r>
+        <w:rPr>
+          <w:rFonts w:ascii="Times New Roman" w:eastAsia="Times New Roman" w:hAnsi="Times New Roman" w:cs="Times New Roman"/>
+          <w:sz w:val="26"/>
+          <w:szCs w:val="26"/>
         </w:rPr>
         <w:t xml:space="preserve">Hệ thống chuyển ảnh sang ảnh xám (Grayscale), làm mờ (Gaussian Blur) và dùng thuật toán </w:t>
       </w:r>
@@ -166,16 +166,16 @@
           <w:rFonts w:ascii="Times New Roman" w:eastAsia="Times New Roman" w:hAnsi="Times New Roman" w:cs="Times New Roman"/>
           <w:b/>
           <w:bCs/>
-          <w:sz w:val="24"/>
-          <w:szCs w:val="24"/>
+          <w:sz w:val="26"/>
+          <w:szCs w:val="26"/>
         </w:rPr>
         <w:t>Canny Edge Detection</w:t>
       </w:r>
       <w:r>
         <w:rPr>
           <w:rFonts w:ascii="Times New Roman" w:eastAsia="Times New Roman" w:hAnsi="Times New Roman" w:cs="Times New Roman"/>
-          <w:sz w:val="24"/>
-          <w:szCs w:val="24"/>
+          <w:sz w:val="26"/>
+          <w:szCs w:val="26"/>
         </w:rPr>
         <w:t xml:space="preserve"> để tìm các đường viền.</w:t>
       </w:r>
@@ -189,15 +189,15 @@
         <w:spacing w:before="100" w:beforeAutospacing="1" w:after="100" w:afterAutospacing="1" w:line="240" w:lineRule="auto"/>
         <w:rPr>
           <w:rFonts w:ascii="Times New Roman" w:eastAsia="Times New Roman" w:hAnsi="Times New Roman" w:cs="Times New Roman"/>
-          <w:sz w:val="24"/>
-          <w:szCs w:val="24"/>
-        </w:rPr>
-      </w:pPr>
-      <w:r>
-        <w:rPr>
-          <w:rFonts w:ascii="Times New Roman" w:eastAsia="Times New Roman" w:hAnsi="Times New Roman" w:cs="Times New Roman"/>
-          <w:sz w:val="24"/>
-          <w:szCs w:val="24"/>
+          <w:sz w:val="26"/>
+          <w:szCs w:val="26"/>
+        </w:rPr>
+      </w:pPr>
+      <w:r>
+        <w:rPr>
+          <w:rFonts w:ascii="Times New Roman" w:eastAsia="Times New Roman" w:hAnsi="Times New Roman" w:cs="Times New Roman"/>
+          <w:sz w:val="26"/>
+          <w:szCs w:val="26"/>
         </w:rPr>
         <w:t>Sử dụng phép toán hình thái học (Dilation) để nối liền các nét đứt gãy, sau đó tìm dải viền ngoài cùng (Contours) lớn nhất.</w:t>
       </w:r>
@@ -211,33 +211,17 @@
         <w:spacing w:before="100" w:beforeAutospacing="1" w:after="100" w:afterAutospacing="1" w:line="240" w:lineRule="auto"/>
         <w:rPr>
           <w:rFonts w:ascii="Times New Roman" w:eastAsia="Times New Roman" w:hAnsi="Times New Roman" w:cs="Times New Roman"/>
-          <w:sz w:val="24"/>
-          <w:szCs w:val="24"/>
-        </w:rPr>
-      </w:pPr>
-      <w:r>
-        <w:rPr>
-          <w:rFonts w:ascii="Times New Roman" w:eastAsia="Times New Roman" w:hAnsi="Times New Roman" w:cs="Times New Roman"/>
-          <w:sz w:val="24"/>
-          <w:szCs w:val="24"/>
-        </w:rPr>
-        <w:t>Áp dụng xấp xỉ đa giác (</w:t>
-      </w:r>
-      <w:r>
-        <w:rPr>
-          <w:rFonts w:ascii="Courier New" w:eastAsia="Times New Roman" w:hAnsi="Courier New" w:cs="Courier New"/>
-          <w:sz w:val="20"/>
-          <w:szCs w:val="20"/>
-        </w:rPr>
-        <w:t>cv2.approxPolyDP</w:t>
-      </w:r>
-      <w:r>
-        <w:rPr>
-          <w:rFonts w:ascii="Times New Roman" w:eastAsia="Times New Roman" w:hAnsi="Times New Roman" w:cs="Times New Roman"/>
-          <w:sz w:val="24"/>
-          <w:szCs w:val="24"/>
-        </w:rPr>
-        <w:t>) để tìm chính xác 4 đỉnh của biển số.</w:t>
+          <w:sz w:val="26"/>
+          <w:szCs w:val="26"/>
+        </w:rPr>
+      </w:pPr>
+      <w:r>
+        <w:rPr>
+          <w:rFonts w:ascii="Times New Roman" w:eastAsia="Times New Roman" w:hAnsi="Times New Roman" w:cs="Times New Roman"/>
+          <w:sz w:val="26"/>
+          <w:szCs w:val="26"/>
+        </w:rPr>
+        <w:t>Áp dụng xấp xỉ đa giác (cv2.approxPolyDP) để tìm chính xác 4 đỉnh của biển số.</w:t>
       </w:r>
     </w:p>
     <w:p>
@@ -249,49 +233,17 @@
         <w:spacing w:before="100" w:beforeAutospacing="1" w:after="100" w:afterAutospacing="1" w:line="240" w:lineRule="auto"/>
         <w:rPr>
           <w:rFonts w:ascii="Times New Roman" w:eastAsia="Times New Roman" w:hAnsi="Times New Roman" w:cs="Times New Roman"/>
-          <w:sz w:val="24"/>
-          <w:szCs w:val="24"/>
-        </w:rPr>
-      </w:pPr>
-      <w:r>
-        <w:rPr>
-          <w:rFonts w:ascii="Times New Roman" w:eastAsia="Times New Roman" w:hAnsi="Times New Roman" w:cs="Times New Roman"/>
-          <w:sz w:val="24"/>
-          <w:szCs w:val="24"/>
-        </w:rPr>
-        <w:t>Sử dụng ma trận chuyển đổi phối cảnh (</w:t>
-      </w:r>
-      <w:r>
-        <w:rPr>
-          <w:rFonts w:ascii="Courier New" w:eastAsia="Times New Roman" w:hAnsi="Courier New" w:cs="Courier New"/>
-          <w:sz w:val="20"/>
-          <w:szCs w:val="20"/>
-        </w:rPr>
-        <w:t>cv2.getPerspectiveTransform</w:t>
-      </w:r>
-      <w:r>
-        <w:rPr>
-          <w:rFonts w:ascii="Times New Roman" w:eastAsia="Times New Roman" w:hAnsi="Times New Roman" w:cs="Times New Roman"/>
-          <w:sz w:val="24"/>
-          <w:szCs w:val="24"/>
-        </w:rPr>
-        <w:t xml:space="preserve"> và </w:t>
-      </w:r>
-      <w:r>
-        <w:rPr>
-          <w:rFonts w:ascii="Courier New" w:eastAsia="Times New Roman" w:hAnsi="Courier New" w:cs="Courier New"/>
-          <w:sz w:val="20"/>
-          <w:szCs w:val="20"/>
-        </w:rPr>
-        <w:t>cv2.warpPerspective</w:t>
-      </w:r>
-      <w:r>
-        <w:rPr>
-          <w:rFonts w:ascii="Times New Roman" w:eastAsia="Times New Roman" w:hAnsi="Times New Roman" w:cs="Times New Roman"/>
-          <w:sz w:val="24"/>
-          <w:szCs w:val="24"/>
-        </w:rPr>
-        <w:t>) để nắn chỉnh (warp) vùng ảnh méo về một kích thước hình chữ nhật chuẩn ($240 \times 180$ đối với biển vuông và $480 \times 120$ đối với biển dài). Kỹ thuật này giúp các ký tự đứng thẳng và đúng tỷ lệ.</w:t>
+          <w:sz w:val="26"/>
+          <w:szCs w:val="26"/>
+        </w:rPr>
+      </w:pPr>
+      <w:r>
+        <w:rPr>
+          <w:rFonts w:ascii="Times New Roman" w:eastAsia="Times New Roman" w:hAnsi="Times New Roman" w:cs="Times New Roman"/>
+          <w:sz w:val="26"/>
+          <w:szCs w:val="26"/>
+        </w:rPr>
+        <w:t>Sử dụng ma trận chuyển đổi phối cảnh (cv2.getPerspectiveTransform và cv2.warpPerspective) để nắn chỉnh (warp) vùng ảnh méo về một kích thước hình chữ nhật chuẩn ($240 \times 180$ đối với biển vuông và $480 \times 120$ đối với biển dài). Kỹ thuật này giúp các ký tự đứng thẳng và đúng tỷ lệ.</w:t>
       </w:r>
     </w:p>
     <w:p>
@@ -302,17 +254,17 @@
           <w:rFonts w:ascii="Times New Roman" w:eastAsia="Times New Roman" w:hAnsi="Times New Roman" w:cs="Times New Roman"/>
           <w:b/>
           <w:bCs/>
-          <w:sz w:val="24"/>
-          <w:szCs w:val="24"/>
-        </w:rPr>
-      </w:pPr>
-      <w:r>
-        <w:rPr>
-          <w:rFonts w:ascii="Times New Roman" w:eastAsia="Times New Roman" w:hAnsi="Times New Roman" w:cs="Times New Roman"/>
-          <w:b/>
-          <w:bCs/>
-          <w:sz w:val="24"/>
-          <w:szCs w:val="24"/>
+          <w:sz w:val="26"/>
+          <w:szCs w:val="26"/>
+        </w:rPr>
+      </w:pPr>
+      <w:r>
+        <w:rPr>
+          <w:rFonts w:ascii="Times New Roman" w:eastAsia="Times New Roman" w:hAnsi="Times New Roman" w:cs="Times New Roman"/>
+          <w:b/>
+          <w:bCs/>
+          <w:sz w:val="26"/>
+          <w:szCs w:val="26"/>
         </w:rPr>
         <w:t>2. Nội suy tăng độ phân giải (Bicubic Interpolation)</w:t>
       </w:r>
@@ -326,25 +278,25 @@
         <w:spacing w:before="100" w:beforeAutospacing="1" w:after="100" w:afterAutospacing="1" w:line="240" w:lineRule="auto"/>
         <w:rPr>
           <w:rFonts w:ascii="Times New Roman" w:eastAsia="Times New Roman" w:hAnsi="Times New Roman" w:cs="Times New Roman"/>
-          <w:sz w:val="24"/>
-          <w:szCs w:val="24"/>
-        </w:rPr>
-      </w:pPr>
-      <w:r>
-        <w:rPr>
-          <w:rFonts w:ascii="Times New Roman" w:eastAsia="Times New Roman" w:hAnsi="Times New Roman" w:cs="Times New Roman"/>
-          <w:b/>
-          <w:bCs/>
-          <w:sz w:val="24"/>
-          <w:szCs w:val="24"/>
+          <w:sz w:val="26"/>
+          <w:szCs w:val="26"/>
+        </w:rPr>
+      </w:pPr>
+      <w:r>
+        <w:rPr>
+          <w:rFonts w:ascii="Times New Roman" w:eastAsia="Times New Roman" w:hAnsi="Times New Roman" w:cs="Times New Roman"/>
+          <w:b/>
+          <w:bCs/>
+          <w:sz w:val="26"/>
+          <w:szCs w:val="26"/>
         </w:rPr>
         <w:t>Vấn đề:</w:t>
       </w:r>
       <w:r>
         <w:rPr>
           <w:rFonts w:ascii="Times New Roman" w:eastAsia="Times New Roman" w:hAnsi="Times New Roman" w:cs="Times New Roman"/>
-          <w:sz w:val="24"/>
-          <w:szCs w:val="24"/>
+          <w:sz w:val="26"/>
+          <w:szCs w:val="26"/>
         </w:rPr>
         <w:t xml:space="preserve"> Kích thước biển số cắt từ camera giao thông thường rất nhỏ (ví dụ: $60 \times 40$ pixel), không đủ lượng thông tin chi tiết cho mạng nơ-ron tích chập (CNN) của mô hình OCR trích xuất đặc trưng.</w:t>
       </w:r>
@@ -358,25 +310,25 @@
         <w:spacing w:before="100" w:beforeAutospacing="1" w:after="100" w:afterAutospacing="1" w:line="240" w:lineRule="auto"/>
         <w:rPr>
           <w:rFonts w:ascii="Times New Roman" w:eastAsia="Times New Roman" w:hAnsi="Times New Roman" w:cs="Times New Roman"/>
-          <w:sz w:val="24"/>
-          <w:szCs w:val="24"/>
-        </w:rPr>
-      </w:pPr>
-      <w:r>
-        <w:rPr>
-          <w:rFonts w:ascii="Times New Roman" w:eastAsia="Times New Roman" w:hAnsi="Times New Roman" w:cs="Times New Roman"/>
-          <w:b/>
-          <w:bCs/>
-          <w:sz w:val="24"/>
-          <w:szCs w:val="24"/>
+          <w:sz w:val="26"/>
+          <w:szCs w:val="26"/>
+        </w:rPr>
+      </w:pPr>
+      <w:r>
+        <w:rPr>
+          <w:rFonts w:ascii="Times New Roman" w:eastAsia="Times New Roman" w:hAnsi="Times New Roman" w:cs="Times New Roman"/>
+          <w:b/>
+          <w:bCs/>
+          <w:sz w:val="26"/>
+          <w:szCs w:val="26"/>
         </w:rPr>
         <w:t>Giải pháp:</w:t>
       </w:r>
       <w:r>
         <w:rPr>
           <w:rFonts w:ascii="Times New Roman" w:eastAsia="Times New Roman" w:hAnsi="Times New Roman" w:cs="Times New Roman"/>
-          <w:sz w:val="24"/>
-          <w:szCs w:val="24"/>
+          <w:sz w:val="26"/>
+          <w:szCs w:val="26"/>
         </w:rPr>
         <w:t xml:space="preserve"> Phóng to ảnh (Scale up) lên gấp 2 lần so với kích thước ban đầu. Thay vì dùng thuật toán nội suy tuyến tính (Linear) thông thường, hệ thống sử dụng </w:t>
       </w:r>
@@ -385,36 +337,16 @@
           <w:rFonts w:ascii="Times New Roman" w:eastAsia="Times New Roman" w:hAnsi="Times New Roman" w:cs="Times New Roman"/>
           <w:b/>
           <w:bCs/>
-          <w:sz w:val="24"/>
-          <w:szCs w:val="24"/>
-        </w:rPr>
-        <w:t xml:space="preserve">Nội suy song khối (Bicubic Interpolation - </w:t>
-      </w:r>
-      <w:r>
-        <w:rPr>
-          <w:rFonts w:ascii="Courier New" w:eastAsia="Times New Roman" w:hAnsi="Courier New" w:cs="Courier New"/>
-          <w:b/>
-          <w:bCs/>
-          <w:sz w:val="20"/>
-          <w:szCs w:val="20"/>
-        </w:rPr>
-        <w:t>cv2.INTER_CUBIC</w:t>
-      </w:r>
-      <w:r>
-        <w:rPr>
-          <w:rFonts w:ascii="Times New Roman" w:eastAsia="Times New Roman" w:hAnsi="Times New Roman" w:cs="Times New Roman"/>
-          <w:b/>
-          <w:bCs/>
-          <w:sz w:val="24"/>
-          <w:szCs w:val="24"/>
-        </w:rPr>
-        <w:t>)</w:t>
-      </w:r>
-      <w:r>
-        <w:rPr>
-          <w:rFonts w:ascii="Times New Roman" w:eastAsia="Times New Roman" w:hAnsi="Times New Roman" w:cs="Times New Roman"/>
-          <w:sz w:val="24"/>
-          <w:szCs w:val="24"/>
+          <w:sz w:val="26"/>
+          <w:szCs w:val="26"/>
+        </w:rPr>
+        <w:t>Nội suy song khối (Bicubic Interpolation - cv2.INTER_CUBIC)</w:t>
+      </w:r>
+      <w:r>
+        <w:rPr>
+          <w:rFonts w:ascii="Times New Roman" w:eastAsia="Times New Roman" w:hAnsi="Times New Roman" w:cs="Times New Roman"/>
+          <w:sz w:val="26"/>
+          <w:szCs w:val="26"/>
         </w:rPr>
         <w:t xml:space="preserve">. Thuật toán này tính toán giá trị pixel mới dựa trên </w:t>
       </w:r>
@@ -422,8 +354,8 @@
       <w:r>
         <w:rPr>
           <w:rFonts w:ascii="Times New Roman" w:eastAsia="Times New Roman" w:hAnsi="Times New Roman" w:cs="Times New Roman"/>
-          <w:sz w:val="24"/>
-          <w:szCs w:val="24"/>
+          <w:sz w:val="26"/>
+          <w:szCs w:val="26"/>
         </w:rPr>
         <w:t>16 pixel</w:t>
       </w:r>
@@ -431,8 +363,8 @@
       <w:r>
         <w:rPr>
           <w:rFonts w:ascii="Times New Roman" w:eastAsia="Times New Roman" w:hAnsi="Times New Roman" w:cs="Times New Roman"/>
-          <w:sz w:val="24"/>
-          <w:szCs w:val="24"/>
+          <w:sz w:val="26"/>
+          <w:szCs w:val="26"/>
         </w:rPr>
         <w:t xml:space="preserve"> lân cận, giúp làm mượt các đường cong của chữ cái và giảm thiểu hiện tượng răng cưa (aliasing) khi phóng to.</w:t>
       </w:r>
@@ -445,17 +377,17 @@
           <w:rFonts w:ascii="Times New Roman" w:eastAsia="Times New Roman" w:hAnsi="Times New Roman" w:cs="Times New Roman"/>
           <w:b/>
           <w:bCs/>
-          <w:sz w:val="24"/>
-          <w:szCs w:val="24"/>
-        </w:rPr>
-      </w:pPr>
-      <w:r>
-        <w:rPr>
-          <w:rFonts w:ascii="Times New Roman" w:eastAsia="Times New Roman" w:hAnsi="Times New Roman" w:cs="Times New Roman"/>
-          <w:b/>
-          <w:bCs/>
-          <w:sz w:val="24"/>
-          <w:szCs w:val="24"/>
+          <w:sz w:val="26"/>
+          <w:szCs w:val="26"/>
+        </w:rPr>
+      </w:pPr>
+      <w:r>
+        <w:rPr>
+          <w:rFonts w:ascii="Times New Roman" w:eastAsia="Times New Roman" w:hAnsi="Times New Roman" w:cs="Times New Roman"/>
+          <w:b/>
+          <w:bCs/>
+          <w:sz w:val="26"/>
+          <w:szCs w:val="26"/>
         </w:rPr>
         <w:t>3. Cân bằng sáng cục bộ (CLAHE - Contrast Limited Adaptive Histogram Equalization)</w:t>
       </w:r>
@@ -469,27 +401,36 @@
         <w:spacing w:before="100" w:beforeAutospacing="1" w:after="100" w:afterAutospacing="1" w:line="240" w:lineRule="auto"/>
         <w:rPr>
           <w:rFonts w:ascii="Times New Roman" w:eastAsia="Times New Roman" w:hAnsi="Times New Roman" w:cs="Times New Roman"/>
-          <w:sz w:val="24"/>
-          <w:szCs w:val="24"/>
-        </w:rPr>
-      </w:pPr>
-      <w:r>
-        <w:rPr>
-          <w:rFonts w:ascii="Times New Roman" w:eastAsia="Times New Roman" w:hAnsi="Times New Roman" w:cs="Times New Roman"/>
-          <w:b/>
-          <w:bCs/>
-          <w:sz w:val="24"/>
-          <w:szCs w:val="24"/>
+          <w:sz w:val="26"/>
+          <w:szCs w:val="26"/>
+        </w:rPr>
+      </w:pPr>
+      <w:r>
+        <w:rPr>
+          <w:rFonts w:ascii="Times New Roman" w:eastAsia="Times New Roman" w:hAnsi="Times New Roman" w:cs="Times New Roman"/>
+          <w:b/>
+          <w:bCs/>
+          <w:sz w:val="26"/>
+          <w:szCs w:val="26"/>
         </w:rPr>
         <w:t>Vấn đề:</w:t>
       </w:r>
       <w:r>
         <w:rPr>
           <w:rFonts w:ascii="Times New Roman" w:eastAsia="Times New Roman" w:hAnsi="Times New Roman" w:cs="Times New Roman"/>
-          <w:sz w:val="24"/>
-          <w:szCs w:val="24"/>
-        </w:rPr>
-        <w:t xml:space="preserve"> Điều kiện ánh sáng thực tế thường không đồng đều (một nửa biển số bị nắng chói, nửa kia nằm trong bóng râm). Cân bằng Histogram truyền thống (Global Histogram Equalization) sẽ làm lóa hoàn toàn các vùng sáng hoặc đẩy nhiễu (noise) ở vùng tối lên quá mức.</w:t>
+          <w:sz w:val="26"/>
+          <w:szCs w:val="26"/>
+        </w:rPr>
+        <w:t xml:space="preserve"> Điều kiện ánh sáng thực tế thường không đồng đều (một nửa biển số bị nắng chói, nửa kia nằm trong bóng râm). Cân bằng Histogram truyền thống </w:t>
+      </w:r>
+      <w:r>
+        <w:rPr>
+          <w:rFonts w:ascii="Times New Roman" w:eastAsia="Times New Roman" w:hAnsi="Times New Roman" w:cs="Times New Roman"/>
+          <w:sz w:val="26"/>
+          <w:szCs w:val="26"/>
+        </w:rPr>
+        <w:lastRenderedPageBreak/>
+        <w:t>(Global Histogram Equalization) sẽ làm lóa hoàn toàn các vùng sáng hoặc đẩy nhiễu (noise) ở vùng tối lên quá mức.</w:t>
       </w:r>
     </w:p>
     <w:p>
@@ -501,17 +442,17 @@
         <w:spacing w:before="100" w:beforeAutospacing="1" w:after="100" w:afterAutospacing="1" w:line="240" w:lineRule="auto"/>
         <w:rPr>
           <w:rFonts w:ascii="Times New Roman" w:eastAsia="Times New Roman" w:hAnsi="Times New Roman" w:cs="Times New Roman"/>
-          <w:sz w:val="24"/>
-          <w:szCs w:val="24"/>
-        </w:rPr>
-      </w:pPr>
-      <w:r>
-        <w:rPr>
-          <w:rFonts w:ascii="Times New Roman" w:eastAsia="Times New Roman" w:hAnsi="Times New Roman" w:cs="Times New Roman"/>
-          <w:b/>
-          <w:bCs/>
-          <w:sz w:val="24"/>
-          <w:szCs w:val="24"/>
+          <w:sz w:val="26"/>
+          <w:szCs w:val="26"/>
+        </w:rPr>
+      </w:pPr>
+      <w:r>
+        <w:rPr>
+          <w:rFonts w:ascii="Times New Roman" w:eastAsia="Times New Roman" w:hAnsi="Times New Roman" w:cs="Times New Roman"/>
+          <w:b/>
+          <w:bCs/>
+          <w:sz w:val="26"/>
+          <w:szCs w:val="26"/>
         </w:rPr>
         <w:t>Giải pháp:</w:t>
       </w:r>
@@ -525,15 +466,15 @@
         <w:spacing w:before="100" w:beforeAutospacing="1" w:after="100" w:afterAutospacing="1" w:line="240" w:lineRule="auto"/>
         <w:rPr>
           <w:rFonts w:ascii="Times New Roman" w:eastAsia="Times New Roman" w:hAnsi="Times New Roman" w:cs="Times New Roman"/>
-          <w:sz w:val="24"/>
-          <w:szCs w:val="24"/>
-        </w:rPr>
-      </w:pPr>
-      <w:r>
-        <w:rPr>
-          <w:rFonts w:ascii="Times New Roman" w:eastAsia="Times New Roman" w:hAnsi="Times New Roman" w:cs="Times New Roman"/>
-          <w:sz w:val="24"/>
-          <w:szCs w:val="24"/>
+          <w:sz w:val="26"/>
+          <w:szCs w:val="26"/>
+        </w:rPr>
+      </w:pPr>
+      <w:r>
+        <w:rPr>
+          <w:rFonts w:ascii="Times New Roman" w:eastAsia="Times New Roman" w:hAnsi="Times New Roman" w:cs="Times New Roman"/>
+          <w:sz w:val="26"/>
+          <w:szCs w:val="26"/>
         </w:rPr>
         <w:t xml:space="preserve">Hệ thống áp dụng thuật toán </w:t>
       </w:r>
@@ -542,68 +483,36 @@
           <w:rFonts w:ascii="Times New Roman" w:eastAsia="Times New Roman" w:hAnsi="Times New Roman" w:cs="Times New Roman"/>
           <w:b/>
           <w:bCs/>
-          <w:sz w:val="24"/>
-          <w:szCs w:val="24"/>
+          <w:sz w:val="26"/>
+          <w:szCs w:val="26"/>
         </w:rPr>
         <w:t>CLAHE</w:t>
       </w:r>
       <w:r>
         <w:rPr>
           <w:rFonts w:ascii="Times New Roman" w:eastAsia="Times New Roman" w:hAnsi="Times New Roman" w:cs="Times New Roman"/>
-          <w:sz w:val="24"/>
-          <w:szCs w:val="24"/>
-        </w:rPr>
-        <w:t xml:space="preserve"> với tham số </w:t>
-      </w:r>
-      <w:r>
-        <w:rPr>
-          <w:rFonts w:ascii="Courier New" w:eastAsia="Times New Roman" w:hAnsi="Courier New" w:cs="Courier New"/>
-          <w:sz w:val="20"/>
-          <w:szCs w:val="20"/>
-        </w:rPr>
-        <w:t>clipLimit=1.5</w:t>
-      </w:r>
-      <w:r>
-        <w:rPr>
-          <w:rFonts w:ascii="Times New Roman" w:eastAsia="Times New Roman" w:hAnsi="Times New Roman" w:cs="Times New Roman"/>
-          <w:sz w:val="24"/>
-          <w:szCs w:val="24"/>
-        </w:rPr>
-        <w:t xml:space="preserve"> và chia ảnh thành các ô lưới nhỏ </w:t>
-      </w:r>
-      <w:r>
-        <w:rPr>
-          <w:rFonts w:ascii="Courier New" w:eastAsia="Times New Roman" w:hAnsi="Courier New" w:cs="Courier New"/>
-          <w:sz w:val="20"/>
-          <w:szCs w:val="20"/>
-        </w:rPr>
-        <w:t>tileGridSize</w:t>
+          <w:sz w:val="26"/>
+          <w:szCs w:val="26"/>
+        </w:rPr>
+        <w:t xml:space="preserve"> với tham số clipLimit=1.5 và chia ảnh thành các ô lưới nhỏ tileGridSize</w:t>
       </w:r>
       <w:proofErr w:type="gramStart"/>
       <w:r>
         <w:rPr>
-          <w:rFonts w:ascii="Courier New" w:eastAsia="Times New Roman" w:hAnsi="Courier New" w:cs="Courier New"/>
-          <w:sz w:val="20"/>
-          <w:szCs w:val="20"/>
+          <w:rFonts w:ascii="Times New Roman" w:eastAsia="Times New Roman" w:hAnsi="Times New Roman" w:cs="Times New Roman"/>
+          <w:sz w:val="26"/>
+          <w:szCs w:val="26"/>
         </w:rPr>
         <w:t>=(</w:t>
       </w:r>
       <w:proofErr w:type="gramEnd"/>
       <w:r>
         <w:rPr>
-          <w:rFonts w:ascii="Courier New" w:eastAsia="Times New Roman" w:hAnsi="Courier New" w:cs="Courier New"/>
-          <w:sz w:val="20"/>
-          <w:szCs w:val="20"/>
-        </w:rPr>
-        <w:t>4, 4)</w:t>
-      </w:r>
-      <w:r>
-        <w:rPr>
-          <w:rFonts w:ascii="Times New Roman" w:eastAsia="Times New Roman" w:hAnsi="Times New Roman" w:cs="Times New Roman"/>
-          <w:sz w:val="24"/>
-          <w:szCs w:val="24"/>
-        </w:rPr>
-        <w:t>.</w:t>
+          <w:rFonts w:ascii="Times New Roman" w:eastAsia="Times New Roman" w:hAnsi="Times New Roman" w:cs="Times New Roman"/>
+          <w:sz w:val="26"/>
+          <w:szCs w:val="26"/>
+        </w:rPr>
+        <w:t>4, 4).</w:t>
       </w:r>
     </w:p>
     <w:p>
@@ -615,26 +524,17 @@
         <w:spacing w:before="100" w:beforeAutospacing="1" w:after="100" w:afterAutospacing="1" w:line="240" w:lineRule="auto"/>
         <w:rPr>
           <w:rFonts w:ascii="Times New Roman" w:eastAsia="Times New Roman" w:hAnsi="Times New Roman" w:cs="Times New Roman"/>
-          <w:sz w:val="24"/>
-          <w:szCs w:val="24"/>
-        </w:rPr>
-      </w:pPr>
-      <w:r>
-        <w:rPr>
-          <w:rFonts w:ascii="Times New Roman" w:eastAsia="Times New Roman" w:hAnsi="Times New Roman" w:cs="Times New Roman"/>
-          <w:sz w:val="24"/>
-          <w:szCs w:val="24"/>
-        </w:rPr>
-        <w:t xml:space="preserve">CLAHE thực hiện cân bằng độ tương phản trong từng vùng nhỏ cục bộ thay vì toàn bộ bức ảnh. Việc giới hạn độ tương phản (Contrast Limit) giúp hệ thống làm </w:t>
-      </w:r>
-      <w:r>
-        <w:rPr>
-          <w:rFonts w:ascii="Times New Roman" w:eastAsia="Times New Roman" w:hAnsi="Times New Roman" w:cs="Times New Roman"/>
-          <w:sz w:val="24"/>
-          <w:szCs w:val="24"/>
-        </w:rPr>
-        <w:lastRenderedPageBreak/>
-        <w:t>rõ nét các viền chữ mờ nhạt mà không khuếch đại nhiễu nén (JPEG artifacts) của camera.</w:t>
+          <w:sz w:val="26"/>
+          <w:szCs w:val="26"/>
+        </w:rPr>
+      </w:pPr>
+      <w:r>
+        <w:rPr>
+          <w:rFonts w:ascii="Times New Roman" w:eastAsia="Times New Roman" w:hAnsi="Times New Roman" w:cs="Times New Roman"/>
+          <w:sz w:val="26"/>
+          <w:szCs w:val="26"/>
+        </w:rPr>
+        <w:t>CLAHE thực hiện cân bằng độ tương phản trong từng vùng nhỏ cục bộ thay vì toàn bộ bức ảnh. Việc giới hạn độ tương phản (Contrast Limit) giúp hệ thống làm rõ nét các viền chữ mờ nhạt mà không khuếch đại nhiễu nén (JPEG artifacts) của camera.</w:t>
       </w:r>
     </w:p>
     <w:p>
@@ -645,17 +545,17 @@
           <w:rFonts w:ascii="Times New Roman" w:eastAsia="Times New Roman" w:hAnsi="Times New Roman" w:cs="Times New Roman"/>
           <w:b/>
           <w:bCs/>
-          <w:sz w:val="24"/>
-          <w:szCs w:val="24"/>
-        </w:rPr>
-      </w:pPr>
-      <w:r>
-        <w:rPr>
-          <w:rFonts w:ascii="Times New Roman" w:eastAsia="Times New Roman" w:hAnsi="Times New Roman" w:cs="Times New Roman"/>
-          <w:b/>
-          <w:bCs/>
-          <w:sz w:val="24"/>
-          <w:szCs w:val="24"/>
+          <w:sz w:val="26"/>
+          <w:szCs w:val="26"/>
+        </w:rPr>
+      </w:pPr>
+      <w:r>
+        <w:rPr>
+          <w:rFonts w:ascii="Times New Roman" w:eastAsia="Times New Roman" w:hAnsi="Times New Roman" w:cs="Times New Roman"/>
+          <w:b/>
+          <w:bCs/>
+          <w:sz w:val="26"/>
+          <w:szCs w:val="26"/>
         </w:rPr>
         <w:t>4. Giữ nguyên viền nét chữ mềm mại (Anti-Aliasing Preservation) thay vì Nhị phân hóa</w:t>
       </w:r>
@@ -669,25 +569,25 @@
         <w:spacing w:before="100" w:beforeAutospacing="1" w:after="100" w:afterAutospacing="1" w:line="240" w:lineRule="auto"/>
         <w:rPr>
           <w:rFonts w:ascii="Times New Roman" w:eastAsia="Times New Roman" w:hAnsi="Times New Roman" w:cs="Times New Roman"/>
-          <w:sz w:val="24"/>
-          <w:szCs w:val="24"/>
-        </w:rPr>
-      </w:pPr>
-      <w:r>
-        <w:rPr>
-          <w:rFonts w:ascii="Times New Roman" w:eastAsia="Times New Roman" w:hAnsi="Times New Roman" w:cs="Times New Roman"/>
-          <w:b/>
-          <w:bCs/>
-          <w:sz w:val="24"/>
-          <w:szCs w:val="24"/>
+          <w:sz w:val="26"/>
+          <w:szCs w:val="26"/>
+        </w:rPr>
+      </w:pPr>
+      <w:r>
+        <w:rPr>
+          <w:rFonts w:ascii="Times New Roman" w:eastAsia="Times New Roman" w:hAnsi="Times New Roman" w:cs="Times New Roman"/>
+          <w:b/>
+          <w:bCs/>
+          <w:sz w:val="26"/>
+          <w:szCs w:val="26"/>
         </w:rPr>
         <w:t>Điểm tối ưu khác biệt:</w:t>
       </w:r>
       <w:r>
         <w:rPr>
           <w:rFonts w:ascii="Times New Roman" w:eastAsia="Times New Roman" w:hAnsi="Times New Roman" w:cs="Times New Roman"/>
-          <w:sz w:val="24"/>
-          <w:szCs w:val="24"/>
+          <w:sz w:val="26"/>
+          <w:szCs w:val="26"/>
         </w:rPr>
         <w:t xml:space="preserve"> Thông thường, các hệ thống OCR cũ (như Tesseract) yêu cầu nhị phân hóa ảnh (Otsu Thresholding) để biến ảnh thành dạng Trắng/Đen hoàn toàn. Tuy nhiên, qua quá trình thử nghiệm thực tế, việc ép nhị phân làm mất đi các pixel xám chuyển tiếp ở viền chữ (Anti-aliasing), khiến các nét chữ bị vỡ hoặc các ký tự dính vào nhau.</w:t>
       </w:r>
@@ -701,25 +601,25 @@
         <w:spacing w:before="100" w:beforeAutospacing="1" w:after="100" w:afterAutospacing="1" w:line="240" w:lineRule="auto"/>
         <w:rPr>
           <w:rFonts w:ascii="Times New Roman" w:eastAsia="Times New Roman" w:hAnsi="Times New Roman" w:cs="Times New Roman"/>
-          <w:sz w:val="24"/>
-          <w:szCs w:val="24"/>
-        </w:rPr>
-      </w:pPr>
-      <w:r>
-        <w:rPr>
-          <w:rFonts w:ascii="Times New Roman" w:eastAsia="Times New Roman" w:hAnsi="Times New Roman" w:cs="Times New Roman"/>
-          <w:b/>
-          <w:bCs/>
-          <w:sz w:val="24"/>
-          <w:szCs w:val="24"/>
+          <w:sz w:val="26"/>
+          <w:szCs w:val="26"/>
+        </w:rPr>
+      </w:pPr>
+      <w:r>
+        <w:rPr>
+          <w:rFonts w:ascii="Times New Roman" w:eastAsia="Times New Roman" w:hAnsi="Times New Roman" w:cs="Times New Roman"/>
+          <w:b/>
+          <w:bCs/>
+          <w:sz w:val="26"/>
+          <w:szCs w:val="26"/>
         </w:rPr>
         <w:t>Giải pháp:</w:t>
       </w:r>
       <w:r>
         <w:rPr>
           <w:rFonts w:ascii="Times New Roman" w:eastAsia="Times New Roman" w:hAnsi="Times New Roman" w:cs="Times New Roman"/>
-          <w:sz w:val="24"/>
-          <w:szCs w:val="24"/>
+          <w:sz w:val="26"/>
+          <w:szCs w:val="26"/>
         </w:rPr>
         <w:t xml:space="preserve"> Hệ thống được thiết kế để </w:t>
       </w:r>
@@ -728,21 +628,1289 @@
           <w:rFonts w:ascii="Times New Roman" w:eastAsia="Times New Roman" w:hAnsi="Times New Roman" w:cs="Times New Roman"/>
           <w:b/>
           <w:bCs/>
-          <w:sz w:val="24"/>
-          <w:szCs w:val="24"/>
+          <w:sz w:val="26"/>
+          <w:szCs w:val="26"/>
         </w:rPr>
         <w:t>bỏ qua bước Nhị phân hóa</w:t>
       </w:r>
       <w:r>
         <w:rPr>
           <w:rFonts w:ascii="Times New Roman" w:eastAsia="Times New Roman" w:hAnsi="Times New Roman" w:cs="Times New Roman"/>
-          <w:sz w:val="24"/>
-          <w:szCs w:val="24"/>
+          <w:sz w:val="26"/>
+          <w:szCs w:val="26"/>
         </w:rPr>
         <w:t>. Ảnh sau khi đi qua bộ lọc CLAHE sẽ được chuyển đổi ngược lại thành không gian màu 3 kênh (BGR) để đưa thẳng vào PaddleOCR. Các mô hình Deep Learning hiện đại như PaddleOCR hoạt động hiệu quả nhất khi được cung cấp đầy đủ thông tin về sắc độ của nét chữ tự nhiên.</w:t>
       </w:r>
     </w:p>
-    <w:p/>
+    <w:p>
+      <w:pPr>
+        <w:rPr>
+          <w:rFonts w:ascii="Times New Roman" w:hAnsi="Times New Roman" w:cs="Times New Roman"/>
+          <w:sz w:val="26"/>
+          <w:szCs w:val="26"/>
+        </w:rPr>
+      </w:pPr>
+    </w:p>
+    <w:p>
+      <w:pPr>
+        <w:rPr>
+          <w:rFonts w:ascii="Times New Roman" w:hAnsi="Times New Roman" w:cs="Times New Roman"/>
+          <w:sz w:val="26"/>
+          <w:szCs w:val="26"/>
+        </w:rPr>
+      </w:pPr>
+      <w:r>
+        <w:rPr>
+          <w:rFonts w:ascii="Times New Roman" w:hAnsi="Times New Roman" w:cs="Times New Roman"/>
+          <w:sz w:val="26"/>
+          <w:szCs w:val="26"/>
+        </w:rPr>
+        <w:t xml:space="preserve">Kịch bản cảnh </w:t>
+      </w:r>
+      <w:proofErr w:type="gramStart"/>
+      <w:r>
+        <w:rPr>
+          <w:rFonts w:ascii="Times New Roman" w:hAnsi="Times New Roman" w:cs="Times New Roman"/>
+          <w:sz w:val="26"/>
+          <w:szCs w:val="26"/>
+        </w:rPr>
+        <w:t>báo :</w:t>
+      </w:r>
+      <w:proofErr w:type="gramEnd"/>
+      <w:r>
+        <w:rPr>
+          <w:rFonts w:ascii="Times New Roman" w:hAnsi="Times New Roman" w:cs="Times New Roman"/>
+          <w:sz w:val="26"/>
+          <w:szCs w:val="26"/>
+        </w:rPr>
+        <w:t xml:space="preserve"> </w:t>
+      </w:r>
+    </w:p>
+    <w:p>
+      <w:pPr>
+        <w:pStyle w:val="Heading3"/>
+        <w:rPr>
+          <w:sz w:val="26"/>
+          <w:szCs w:val="26"/>
+        </w:rPr>
+      </w:pPr>
+      <w:r>
+        <w:rPr>
+          <w:sz w:val="26"/>
+          <w:szCs w:val="26"/>
+        </w:rPr>
+        <w:t>1. Phân tích Logic 3 Kịch bản &amp; Mức độ cảnh báo</w:t>
+      </w:r>
+    </w:p>
+    <w:p>
+      <w:pPr>
+        <w:pStyle w:val="Heading4"/>
+        <w:rPr>
+          <w:sz w:val="26"/>
+          <w:szCs w:val="26"/>
+        </w:rPr>
+      </w:pPr>
+      <w:r>
+        <w:rPr>
+          <w:sz w:val="26"/>
+          <w:szCs w:val="26"/>
+        </w:rPr>
+        <w:t>Kịch bản 1: Phát hiện, ghi và tra cứu biển số (Lưu Log định kỳ)</w:t>
+      </w:r>
+    </w:p>
+    <w:p>
+      <w:pPr>
+        <w:pStyle w:val="NormalWeb"/>
+        <w:numPr>
+          <w:ilvl w:val="0"/>
+          <w:numId w:val="5"/>
+        </w:numPr>
+        <w:rPr>
+          <w:sz w:val="26"/>
+          <w:szCs w:val="26"/>
+        </w:rPr>
+      </w:pPr>
+      <w:r>
+        <w:rPr>
+          <w:b/>
+          <w:bCs/>
+          <w:sz w:val="26"/>
+          <w:szCs w:val="26"/>
+        </w:rPr>
+        <w:t>Logic:</w:t>
+      </w:r>
+      <w:r>
+        <w:rPr>
+          <w:sz w:val="26"/>
+          <w:szCs w:val="26"/>
+        </w:rPr>
+        <w:t xml:space="preserve"> Bất cứ khi nào một xe được chốt biển số (</w:t>
+      </w:r>
+      <w:r>
+        <w:rPr>
+          <w:rStyle w:val="HTMLCode"/>
+          <w:rFonts w:ascii="Times New Roman" w:hAnsi="Times New Roman" w:cs="Times New Roman"/>
+          <w:sz w:val="26"/>
+          <w:szCs w:val="26"/>
+        </w:rPr>
+        <w:t>[OK]</w:t>
+      </w:r>
+      <w:r>
+        <w:rPr>
+          <w:sz w:val="26"/>
+          <w:szCs w:val="26"/>
+        </w:rPr>
+        <w:t xml:space="preserve">), hệ thống sẽ tự động lưu 1 dòng vào file </w:t>
+      </w:r>
+      <w:r>
+        <w:rPr>
+          <w:rStyle w:val="HTMLCode"/>
+          <w:rFonts w:ascii="Times New Roman" w:hAnsi="Times New Roman" w:cs="Times New Roman"/>
+          <w:sz w:val="26"/>
+          <w:szCs w:val="26"/>
+        </w:rPr>
+        <w:t>logs/danh_sach_xe.csv</w:t>
+      </w:r>
+      <w:r>
+        <w:rPr>
+          <w:sz w:val="26"/>
+          <w:szCs w:val="26"/>
+        </w:rPr>
+        <w:t xml:space="preserve"> và chụp 1 tấm ảnh biển số lưu vào thư mục </w:t>
+      </w:r>
+      <w:r>
+        <w:rPr>
+          <w:rStyle w:val="HTMLCode"/>
+          <w:rFonts w:ascii="Times New Roman" w:hAnsi="Times New Roman" w:cs="Times New Roman"/>
+          <w:sz w:val="26"/>
+          <w:szCs w:val="26"/>
+        </w:rPr>
+        <w:t>logs/plates/</w:t>
+      </w:r>
+      <w:r>
+        <w:rPr>
+          <w:sz w:val="26"/>
+          <w:szCs w:val="26"/>
+        </w:rPr>
+        <w:t>.</w:t>
+      </w:r>
+    </w:p>
+    <w:p>
+      <w:pPr>
+        <w:pStyle w:val="NormalWeb"/>
+        <w:numPr>
+          <w:ilvl w:val="0"/>
+          <w:numId w:val="5"/>
+        </w:numPr>
+        <w:rPr>
+          <w:sz w:val="26"/>
+          <w:szCs w:val="26"/>
+        </w:rPr>
+      </w:pPr>
+      <w:r>
+        <w:rPr>
+          <w:b/>
+          <w:bCs/>
+          <w:sz w:val="26"/>
+          <w:szCs w:val="26"/>
+        </w:rPr>
+        <w:t>Tra cứu:</w:t>
+      </w:r>
+      <w:r>
+        <w:rPr>
+          <w:sz w:val="26"/>
+          <w:szCs w:val="26"/>
+        </w:rPr>
+        <w:t xml:space="preserve"> File CSV mở bằng Excel rất dễ dàng để tra cứu thời gian xe ra/vào.</w:t>
+      </w:r>
+    </w:p>
+    <w:p>
+      <w:pPr>
+        <w:pStyle w:val="Heading4"/>
+        <w:rPr>
+          <w:sz w:val="26"/>
+          <w:szCs w:val="26"/>
+        </w:rPr>
+      </w:pPr>
+      <w:r>
+        <w:rPr>
+          <w:sz w:val="26"/>
+          <w:szCs w:val="26"/>
+        </w:rPr>
+        <w:t>Kịch bản 2: Dừng đỗ sai quy định (Đo thời gian dừng)</w:t>
+      </w:r>
+    </w:p>
+    <w:p>
+      <w:pPr>
+        <w:pStyle w:val="NormalWeb"/>
+        <w:numPr>
+          <w:ilvl w:val="0"/>
+          <w:numId w:val="6"/>
+        </w:numPr>
+        <w:rPr>
+          <w:sz w:val="26"/>
+          <w:szCs w:val="26"/>
+        </w:rPr>
+      </w:pPr>
+      <w:r>
+        <w:rPr>
+          <w:b/>
+          <w:bCs/>
+          <w:sz w:val="26"/>
+          <w:szCs w:val="26"/>
+        </w:rPr>
+        <w:t>Logic:</w:t>
+      </w:r>
+      <w:r>
+        <w:rPr>
+          <w:sz w:val="26"/>
+          <w:szCs w:val="26"/>
+        </w:rPr>
+        <w:t xml:space="preserve"> Giám sát vận tốc của từng xe. Nếu vận tốc </w:t>
+      </w:r>
+      <w:r>
+        <w:rPr>
+          <w:rStyle w:val="math-inline"/>
+          <w:sz w:val="26"/>
+          <w:szCs w:val="26"/>
+        </w:rPr>
+        <w:t>$\approx 0$</w:t>
+      </w:r>
+      <w:r>
+        <w:rPr>
+          <w:sz w:val="26"/>
+          <w:szCs w:val="26"/>
+        </w:rPr>
+        <w:t xml:space="preserve"> (dưới ngưỡng xê dịch cho phép của camera), ta bắt đầu đếm giờ.</w:t>
+      </w:r>
+    </w:p>
+    <w:p>
+      <w:pPr>
+        <w:pStyle w:val="NormalWeb"/>
+        <w:numPr>
+          <w:ilvl w:val="0"/>
+          <w:numId w:val="6"/>
+        </w:numPr>
+        <w:rPr>
+          <w:sz w:val="26"/>
+          <w:szCs w:val="26"/>
+        </w:rPr>
+      </w:pPr>
+      <w:r>
+        <w:rPr>
+          <w:b/>
+          <w:bCs/>
+          <w:sz w:val="26"/>
+          <w:szCs w:val="26"/>
+        </w:rPr>
+        <w:t>Các mức cảnh báo:</w:t>
+      </w:r>
+    </w:p>
+    <w:p>
+      <w:pPr>
+        <w:pStyle w:val="NormalWeb"/>
+        <w:numPr>
+          <w:ilvl w:val="1"/>
+          <w:numId w:val="6"/>
+        </w:numPr>
+        <w:rPr>
+          <w:sz w:val="26"/>
+          <w:szCs w:val="26"/>
+        </w:rPr>
+      </w:pPr>
+      <w:r>
+        <w:rPr>
+          <w:b/>
+          <w:bCs/>
+          <w:sz w:val="26"/>
+          <w:szCs w:val="26"/>
+        </w:rPr>
+        <w:t>Mức 0 (Bình thường):</w:t>
+      </w:r>
+      <w:r>
+        <w:rPr>
+          <w:sz w:val="26"/>
+          <w:szCs w:val="26"/>
+        </w:rPr>
+        <w:t xml:space="preserve"> Xe đang di chuyển (Khung viền Xanh lá).</w:t>
+      </w:r>
+    </w:p>
+    <w:p>
+      <w:pPr>
+        <w:pStyle w:val="NormalWeb"/>
+        <w:numPr>
+          <w:ilvl w:val="1"/>
+          <w:numId w:val="6"/>
+        </w:numPr>
+        <w:rPr>
+          <w:sz w:val="26"/>
+          <w:szCs w:val="26"/>
+        </w:rPr>
+      </w:pPr>
+      <w:r>
+        <w:rPr>
+          <w:b/>
+          <w:bCs/>
+          <w:sz w:val="26"/>
+          <w:szCs w:val="26"/>
+        </w:rPr>
+        <w:lastRenderedPageBreak/>
+        <w:t>Mức 1 (Cảnh báo/Nhắc nhở):</w:t>
+      </w:r>
+      <w:r>
+        <w:rPr>
+          <w:sz w:val="26"/>
+          <w:szCs w:val="26"/>
+        </w:rPr>
+        <w:t xml:space="preserve"> Dừng quá </w:t>
+      </w:r>
+      <w:r>
+        <w:rPr>
+          <w:b/>
+          <w:bCs/>
+          <w:sz w:val="26"/>
+          <w:szCs w:val="26"/>
+        </w:rPr>
+        <w:t>10 giây</w:t>
+      </w:r>
+      <w:r>
+        <w:rPr>
+          <w:sz w:val="26"/>
+          <w:szCs w:val="26"/>
+        </w:rPr>
+        <w:t xml:space="preserve"> (Khung viền Vàng/Cam + Hiển thị chữ "Cảnh báo đỗ: 12s").</w:t>
+      </w:r>
+    </w:p>
+    <w:p>
+      <w:pPr>
+        <w:pStyle w:val="NormalWeb"/>
+        <w:numPr>
+          <w:ilvl w:val="1"/>
+          <w:numId w:val="6"/>
+        </w:numPr>
+        <w:rPr>
+          <w:sz w:val="26"/>
+          <w:szCs w:val="26"/>
+        </w:rPr>
+      </w:pPr>
+      <w:r>
+        <w:rPr>
+          <w:b/>
+          <w:bCs/>
+          <w:sz w:val="26"/>
+          <w:szCs w:val="26"/>
+        </w:rPr>
+        <w:t>Mức 2 (Vi phạm):</w:t>
+      </w:r>
+      <w:r>
+        <w:rPr>
+          <w:sz w:val="26"/>
+          <w:szCs w:val="26"/>
+        </w:rPr>
+        <w:t xml:space="preserve"> Dừng quá </w:t>
+      </w:r>
+      <w:r>
+        <w:rPr>
+          <w:b/>
+          <w:bCs/>
+          <w:sz w:val="26"/>
+          <w:szCs w:val="26"/>
+        </w:rPr>
+        <w:t>30 giây</w:t>
+      </w:r>
+      <w:r>
+        <w:rPr>
+          <w:sz w:val="26"/>
+          <w:szCs w:val="26"/>
+        </w:rPr>
+        <w:t xml:space="preserve"> (Khung viền Đỏ + Chữ "VI PHẠM". Chụp ngay 1 ảnh toàn cảnh và ghi vào file </w:t>
+      </w:r>
+      <w:r>
+        <w:rPr>
+          <w:rStyle w:val="HTMLCode"/>
+          <w:rFonts w:ascii="Times New Roman" w:hAnsi="Times New Roman" w:cs="Times New Roman"/>
+          <w:sz w:val="26"/>
+          <w:szCs w:val="26"/>
+        </w:rPr>
+        <w:t>logs/vi_pham.csv</w:t>
+      </w:r>
+      <w:r>
+        <w:rPr>
+          <w:sz w:val="26"/>
+          <w:szCs w:val="26"/>
+        </w:rPr>
+        <w:t>).</w:t>
+      </w:r>
+    </w:p>
+    <w:p>
+      <w:pPr>
+        <w:pStyle w:val="Heading4"/>
+        <w:rPr>
+          <w:sz w:val="26"/>
+          <w:szCs w:val="26"/>
+        </w:rPr>
+      </w:pPr>
+      <w:r>
+        <w:rPr>
+          <w:sz w:val="26"/>
+          <w:szCs w:val="26"/>
+        </w:rPr>
+        <w:t>Kịch bản 3: Tắc nghẽn giao thông (Mật độ + Vận tốc đám đông)</w:t>
+      </w:r>
+    </w:p>
+    <w:p>
+      <w:pPr>
+        <w:pStyle w:val="NormalWeb"/>
+        <w:numPr>
+          <w:ilvl w:val="0"/>
+          <w:numId w:val="7"/>
+        </w:numPr>
+        <w:rPr>
+          <w:sz w:val="26"/>
+          <w:szCs w:val="26"/>
+        </w:rPr>
+      </w:pPr>
+      <w:r>
+        <w:rPr>
+          <w:b/>
+          <w:bCs/>
+          <w:sz w:val="26"/>
+          <w:szCs w:val="26"/>
+        </w:rPr>
+        <w:t>Các mức cảnh báo:</w:t>
+      </w:r>
+    </w:p>
+    <w:p>
+      <w:pPr>
+        <w:pStyle w:val="NormalWeb"/>
+        <w:numPr>
+          <w:ilvl w:val="1"/>
+          <w:numId w:val="7"/>
+        </w:numPr>
+        <w:rPr>
+          <w:sz w:val="26"/>
+          <w:szCs w:val="26"/>
+        </w:rPr>
+      </w:pPr>
+      <w:r>
+        <w:rPr>
+          <w:b/>
+          <w:bCs/>
+          <w:sz w:val="26"/>
+          <w:szCs w:val="26"/>
+        </w:rPr>
+        <w:t>Mức 0 (Thông thoáng):</w:t>
+      </w:r>
+      <w:r>
+        <w:rPr>
+          <w:sz w:val="26"/>
+          <w:szCs w:val="26"/>
+        </w:rPr>
+        <w:t xml:space="preserve"> Số xe </w:t>
+      </w:r>
+      <w:r>
+        <w:rPr>
+          <w:rStyle w:val="math-inline"/>
+          <w:sz w:val="26"/>
+          <w:szCs w:val="26"/>
+        </w:rPr>
+        <w:t>$&lt;$</w:t>
+      </w:r>
+      <w:r>
+        <w:rPr>
+          <w:sz w:val="26"/>
+          <w:szCs w:val="26"/>
+        </w:rPr>
+        <w:t xml:space="preserve"> 10. (Chữ Xanh lá).</w:t>
+      </w:r>
+    </w:p>
+    <w:p>
+      <w:pPr>
+        <w:pStyle w:val="NormalWeb"/>
+        <w:numPr>
+          <w:ilvl w:val="1"/>
+          <w:numId w:val="7"/>
+        </w:numPr>
+        <w:rPr>
+          <w:sz w:val="26"/>
+          <w:szCs w:val="26"/>
+        </w:rPr>
+      </w:pPr>
+      <w:r>
+        <w:rPr>
+          <w:b/>
+          <w:bCs/>
+          <w:sz w:val="26"/>
+          <w:szCs w:val="26"/>
+        </w:rPr>
+        <w:t>Mức 1 (Đông đúc):</w:t>
+      </w:r>
+      <w:r>
+        <w:rPr>
+          <w:sz w:val="26"/>
+          <w:szCs w:val="26"/>
+        </w:rPr>
+        <w:t xml:space="preserve"> Số xe </w:t>
+      </w:r>
+      <w:r>
+        <w:rPr>
+          <w:rStyle w:val="math-inline"/>
+          <w:sz w:val="26"/>
+          <w:szCs w:val="26"/>
+        </w:rPr>
+        <w:t>$\ge$</w:t>
+      </w:r>
+      <w:r>
+        <w:rPr>
+          <w:sz w:val="26"/>
+          <w:szCs w:val="26"/>
+        </w:rPr>
+        <w:t xml:space="preserve"> 10, nhưng vận tốc trung bình </w:t>
+      </w:r>
+      <w:r>
+        <w:rPr>
+          <w:rStyle w:val="math-inline"/>
+          <w:sz w:val="26"/>
+          <w:szCs w:val="26"/>
+        </w:rPr>
+        <w:t>$\ge$</w:t>
+      </w:r>
+      <w:r>
+        <w:rPr>
+          <w:sz w:val="26"/>
+          <w:szCs w:val="26"/>
+        </w:rPr>
+        <w:t xml:space="preserve"> 10 px/s (Xe đông nhưng vẫn di chuyển được - Chữ Vàng).</w:t>
+      </w:r>
+    </w:p>
+    <w:p>
+      <w:pPr>
+        <w:pStyle w:val="NormalWeb"/>
+        <w:numPr>
+          <w:ilvl w:val="1"/>
+          <w:numId w:val="7"/>
+        </w:numPr>
+        <w:rPr>
+          <w:sz w:val="26"/>
+          <w:szCs w:val="26"/>
+        </w:rPr>
+      </w:pPr>
+      <w:r>
+        <w:rPr>
+          <w:b/>
+          <w:bCs/>
+          <w:sz w:val="26"/>
+          <w:szCs w:val="26"/>
+        </w:rPr>
+        <w:t>Mức 2 (Tắc nghẽn):</w:t>
+      </w:r>
+      <w:r>
+        <w:rPr>
+          <w:sz w:val="26"/>
+          <w:szCs w:val="26"/>
+        </w:rPr>
+        <w:t xml:space="preserve"> Số xe </w:t>
+      </w:r>
+      <w:r>
+        <w:rPr>
+          <w:rStyle w:val="math-inline"/>
+          <w:sz w:val="26"/>
+          <w:szCs w:val="26"/>
+        </w:rPr>
+        <w:t>$\ge$</w:t>
+      </w:r>
+      <w:r>
+        <w:rPr>
+          <w:sz w:val="26"/>
+          <w:szCs w:val="26"/>
+        </w:rPr>
+        <w:t xml:space="preserve"> 10 và vận tốc trung bình </w:t>
+      </w:r>
+      <w:r>
+        <w:rPr>
+          <w:rStyle w:val="math-inline"/>
+          <w:sz w:val="26"/>
+          <w:szCs w:val="26"/>
+        </w:rPr>
+        <w:t>$&lt;$</w:t>
+      </w:r>
+      <w:r>
+        <w:rPr>
+          <w:sz w:val="26"/>
+          <w:szCs w:val="26"/>
+        </w:rPr>
+        <w:t xml:space="preserve"> 10 px/s (Đông và kẹt cứng - Chữ Đỏ + Còi báo động trên UI nếu cần).</w:t>
+      </w:r>
+    </w:p>
+    <w:p>
+      <w:pPr>
+        <w:rPr>
+          <w:rFonts w:ascii="Times New Roman" w:hAnsi="Times New Roman" w:cs="Times New Roman"/>
+          <w:sz w:val="26"/>
+          <w:szCs w:val="26"/>
+        </w:rPr>
+      </w:pPr>
+    </w:p>
+    <w:p>
+      <w:pPr>
+        <w:pStyle w:val="Heading3"/>
+      </w:pPr>
+      <w:r>
+        <w:rPr>
+          <w:sz w:val="26"/>
+          <w:szCs w:val="26"/>
+        </w:rPr>
+        <w:t xml:space="preserve">Thuật toán lưu biển </w:t>
+      </w:r>
+      <w:proofErr w:type="gramStart"/>
+      <w:r>
+        <w:rPr>
+          <w:sz w:val="26"/>
+          <w:szCs w:val="26"/>
+        </w:rPr>
+        <w:t>số :</w:t>
+      </w:r>
+      <w:proofErr w:type="gramEnd"/>
+      <w:r>
+        <w:rPr>
+          <w:sz w:val="26"/>
+          <w:szCs w:val="26"/>
+        </w:rPr>
+        <w:t xml:space="preserve"> </w:t>
+      </w:r>
+      <w:r>
+        <w:t>1. Nên lưu ảnh lúc nào? (Lần đầu, Lần cuối, hay Lúc nào khác?)</w:t>
+      </w:r>
+    </w:p>
+    <w:p>
+      <w:pPr>
+        <w:pStyle w:val="NormalWeb"/>
+      </w:pPr>
+      <w:r>
+        <w:t>Việc chọn thời điểm lưu ảnh rất quan trọng để đảm bảo ảnh bằng chứng rõ nét và biển số không bị sai.</w:t>
+      </w:r>
+    </w:p>
+    <w:p>
+      <w:pPr>
+        <w:pStyle w:val="NormalWeb"/>
+        <w:numPr>
+          <w:ilvl w:val="0"/>
+          <w:numId w:val="8"/>
+        </w:numPr>
+      </w:pPr>
+      <w:r>
+        <w:rPr>
+          <w:rFonts w:ascii="Segoe UI Emoji" w:hAnsi="Segoe UI Emoji" w:cs="Segoe UI Emoji"/>
+        </w:rPr>
+        <w:t>❌</w:t>
+      </w:r>
+      <w:r>
+        <w:t xml:space="preserve"> </w:t>
+      </w:r>
+      <w:r>
+        <w:rPr>
+          <w:b/>
+          <w:bCs/>
+        </w:rPr>
+        <w:t>Lưu ngay lần đầu tiên xuất hiện:</w:t>
+      </w:r>
+      <w:r>
+        <w:t xml:space="preserve"> Không nên. Khi xe vừa ló dạng, thường ở xa, ảnh mờ, góc nghiêng lớn, OCR rất dễ đọc sai (ví dụ 8 thành B, 0 thành O). Nếu lưu ngay, bạn sẽ lưu một cái ảnh mờ và một chuỗi text sai.</w:t>
+      </w:r>
+    </w:p>
+    <w:p>
+      <w:pPr>
+        <w:pStyle w:val="NormalWeb"/>
+        <w:numPr>
+          <w:ilvl w:val="0"/>
+          <w:numId w:val="8"/>
+        </w:numPr>
+      </w:pPr>
+      <w:r>
+        <w:rPr>
+          <w:rFonts w:ascii="Segoe UI Emoji" w:hAnsi="Segoe UI Emoji" w:cs="Segoe UI Emoji"/>
+        </w:rPr>
+        <w:t>❌</w:t>
+      </w:r>
+      <w:r>
+        <w:t xml:space="preserve"> </w:t>
+      </w:r>
+      <w:r>
+        <w:rPr>
+          <w:b/>
+          <w:bCs/>
+        </w:rPr>
+        <w:t>Lưu ở lần cuối cùng phát hiện (khi xe ra khỏi camera):</w:t>
+      </w:r>
+      <w:r>
+        <w:t xml:space="preserve"> Khá rủi ro. Bạn phải đợi xe đi khuất mới lưu, lỡ hệ thống bị giật lag hoặc mất tracking giữa chừng, bạn sẽ mất luôn cơ hội lưu ảnh chiếc xe đó. Hơn nữa, ảnh lúc xe đi xa camera cũng sẽ bị mờ dần.</w:t>
+      </w:r>
+    </w:p>
+    <w:p>
+      <w:pPr>
+        <w:pStyle w:val="NormalWeb"/>
+        <w:numPr>
+          <w:ilvl w:val="0"/>
+          <w:numId w:val="8"/>
+        </w:numPr>
+      </w:pPr>
+      <w:r>
+        <w:rPr>
+          <w:rFonts w:ascii="Segoe UI Emoji" w:hAnsi="Segoe UI Emoji" w:cs="Segoe UI Emoji"/>
+        </w:rPr>
+        <w:t>✅</w:t>
+      </w:r>
+      <w:r>
+        <w:t xml:space="preserve"> </w:t>
+      </w:r>
+      <w:r>
+        <w:rPr>
+          <w:b/>
+          <w:bCs/>
+        </w:rPr>
+        <w:t>Giải pháp tối ưu: Lưu ở "Thời điểm được xác nhận" (Confirmed Moment) hoặc "Khung hình tốt nhất" (Best Frame).</w:t>
+      </w:r>
+    </w:p>
+    <w:p>
+      <w:pPr>
+        <w:pStyle w:val="NormalWeb"/>
+        <w:numPr>
+          <w:ilvl w:val="1"/>
+          <w:numId w:val="8"/>
+        </w:numPr>
+      </w:pPr>
+      <w:r>
+        <w:rPr>
+          <w:b/>
+          <w:bCs/>
+        </w:rPr>
+        <w:t>Cách làm:</w:t>
+      </w:r>
+      <w:r>
+        <w:t xml:space="preserve"> Trong module OCR của bạn, chắc chắn phải có cơ chế "bầu chọn" (voting) - ví dụ: OCR đọc ra biển </w:t>
+      </w:r>
+      <w:r>
+        <w:rPr>
+          <w:rStyle w:val="HTMLCode"/>
+        </w:rPr>
+        <w:t>30A-123.45</w:t>
+      </w:r>
+      <w:r>
+        <w:t xml:space="preserve"> liên tục trong 3 hoặc 5 frame thì mới chốt đó là biển thật (để chống nhiễu).</w:t>
+      </w:r>
+    </w:p>
+    <w:p>
+      <w:pPr>
+        <w:pStyle w:val="NormalWeb"/>
+        <w:numPr>
+          <w:ilvl w:val="1"/>
+          <w:numId w:val="8"/>
+        </w:numPr>
+      </w:pPr>
+      <w:r>
+        <w:rPr>
+          <w:b/>
+          <w:bCs/>
+        </w:rPr>
+        <w:t>Hành động:</w:t>
+      </w:r>
+      <w:r>
+        <w:t xml:space="preserve"> Ngay khoảnh khắc hệ thống </w:t>
+      </w:r>
+      <w:r>
+        <w:rPr>
+          <w:b/>
+          <w:bCs/>
+        </w:rPr>
+        <w:t>chốt (confirm) thành công</w:t>
+      </w:r>
+      <w:r>
+        <w:t xml:space="preserve"> biển số đó, hãy lấy chính cái frame hình đó đem đi lưu. Lúc này xe thường đang ở giữa khung hình, rõ nét nhất và text OCR đã đạt độ tin cậy cao.</w:t>
+      </w:r>
+    </w:p>
+    <w:p>
+      <w:pPr>
+        <w:pStyle w:val="Heading3"/>
+      </w:pPr>
+      <w:r>
+        <w:t>2. Bao lâu sau thì lưu lại lần nữa? (Cơ chế Cooldown / Timeout)</w:t>
+      </w:r>
+    </w:p>
+    <w:p>
+      <w:pPr>
+        <w:pStyle w:val="NormalWeb"/>
+      </w:pPr>
+      <w:r>
+        <w:t xml:space="preserve">Nếu một chiếc xe đỗ ở đó cả ngày, camera cứ thấy nó là lưu thì sẽ rác ổ cứng. Bạn cần một cơ chế gọi là </w:t>
+      </w:r>
+      <w:r>
+        <w:rPr>
+          <w:b/>
+          <w:bCs/>
+        </w:rPr>
+        <w:t>Cooldown (Thời gian chờ)</w:t>
+      </w:r>
+      <w:r>
+        <w:t>.</w:t>
+      </w:r>
+    </w:p>
+    <w:p>
+      <w:pPr>
+        <w:pStyle w:val="NormalWeb"/>
+        <w:numPr>
+          <w:ilvl w:val="0"/>
+          <w:numId w:val="9"/>
+        </w:numPr>
+      </w:pPr>
+      <w:r>
+        <w:rPr>
+          <w:b/>
+          <w:bCs/>
+        </w:rPr>
+        <w:lastRenderedPageBreak/>
+        <w:t>Logic hoạt động:</w:t>
+      </w:r>
+      <w:r>
+        <w:t xml:space="preserve"> Bạn tạo một bộ nhớ tạm (Dictionary) để lưu lịch sử các biển số đã được ghi nhận: </w:t>
+      </w:r>
+      <w:r>
+        <w:rPr>
+          <w:rStyle w:val="HTMLCode"/>
+        </w:rPr>
+        <w:t>logged_plates = {"30A12345": frame_thu_1000, "29C55555": frame_thu_1500}</w:t>
+      </w:r>
+      <w:r>
+        <w:t>.</w:t>
+      </w:r>
+    </w:p>
+    <w:p>
+      <w:pPr>
+        <w:pStyle w:val="NormalWeb"/>
+        <w:numPr>
+          <w:ilvl w:val="0"/>
+          <w:numId w:val="9"/>
+        </w:numPr>
+      </w:pPr>
+      <w:r>
+        <w:rPr>
+          <w:b/>
+          <w:bCs/>
+        </w:rPr>
+        <w:t>Khoảng thời gian (Cooldown Time):</w:t>
+      </w:r>
+      <w:r>
+        <w:t xml:space="preserve"> Phụ thuộc vào ngữ cảnh thực tế của bạn:</w:t>
+      </w:r>
+    </w:p>
+    <w:p>
+      <w:pPr>
+        <w:pStyle w:val="NormalWeb"/>
+        <w:numPr>
+          <w:ilvl w:val="1"/>
+          <w:numId w:val="9"/>
+        </w:numPr>
+      </w:pPr>
+      <w:r>
+        <w:t xml:space="preserve">Nếu là </w:t>
+      </w:r>
+      <w:r>
+        <w:rPr>
+          <w:b/>
+          <w:bCs/>
+        </w:rPr>
+        <w:t>Cổng ra/vào (Gate):</w:t>
+      </w:r>
+      <w:r>
+        <w:t xml:space="preserve"> Thời gian xe qua lại nhanh, bạn có thể set cooldown là </w:t>
+      </w:r>
+      <w:r>
+        <w:rPr>
+          <w:b/>
+          <w:bCs/>
+        </w:rPr>
+        <w:t>3 - 5 phút</w:t>
+      </w:r>
+      <w:r>
+        <w:t>. (Nghĩa là chiếc xe đó lùi ra lùi vào cổng trong vòng 3 phút chỉ tính là 1 lượt. Phút thứ 6 quay lại tính là lượt mới).</w:t>
+      </w:r>
+    </w:p>
+    <w:p>
+      <w:pPr>
+        <w:pStyle w:val="NormalWeb"/>
+        <w:numPr>
+          <w:ilvl w:val="1"/>
+          <w:numId w:val="9"/>
+        </w:numPr>
+      </w:pPr>
+      <w:r>
+        <w:t xml:space="preserve">Nếu là </w:t>
+      </w:r>
+      <w:r>
+        <w:rPr>
+          <w:b/>
+          <w:bCs/>
+        </w:rPr>
+        <w:t>Bãi đỗ xe / Lề đường (Parking/Street):</w:t>
+      </w:r>
+      <w:r>
+        <w:t xml:space="preserve"> Thời gian đỗ lâu, bạn có thể set cooldown là </w:t>
+      </w:r>
+      <w:r>
+        <w:rPr>
+          <w:b/>
+          <w:bCs/>
+        </w:rPr>
+        <w:t>15 - 30 phút</w:t>
+      </w:r>
+      <w:r>
+        <w:t>.</w:t>
+      </w:r>
+    </w:p>
+    <w:p>
+      <w:pPr>
+        <w:pStyle w:val="NormalWeb"/>
+        <w:numPr>
+          <w:ilvl w:val="0"/>
+          <w:numId w:val="9"/>
+        </w:numPr>
+      </w:pPr>
+      <w:r>
+        <w:rPr>
+          <w:b/>
+          <w:bCs/>
+        </w:rPr>
+        <w:t>Cách tính bằng Frame (Đồng bộ với logic của bạn):</w:t>
+      </w:r>
+      <w:r>
+        <w:t xml:space="preserve"> Giả sử video 30 FPS. Bạn muốn cooldown 5 phút. Số frame chờ = </w:t>
+      </w:r>
+      <w:r>
+        <w:rPr>
+          <w:rStyle w:val="HTMLCode"/>
+        </w:rPr>
+        <w:t>5 phút * 60 giây * 30 fps = 9.000 frames</w:t>
+      </w:r>
+      <w:r>
+        <w:t>.</w:t>
+      </w:r>
+    </w:p>
+    <w:p>
+      <w:pPr>
+        <w:pStyle w:val="Heading3"/>
+      </w:pPr>
+      <w:r>
+        <w:t>3. Đề xuất luồng Code tích hợp (Kịch bản hoàn chỉnh)</w:t>
+      </w:r>
+    </w:p>
+    <w:p>
+      <w:pPr>
+        <w:pStyle w:val="NormalWeb"/>
+      </w:pPr>
+      <w:r>
+        <w:t xml:space="preserve">Bạn có thể tạo thêm một file hoặc một hàm quản lý việc log biển số này, chạy song song với </w:t>
+      </w:r>
+      <w:r>
+        <w:rPr>
+          <w:rStyle w:val="HTMLCode"/>
+        </w:rPr>
+        <w:t>parking_manager.py</w:t>
+      </w:r>
+      <w:r>
+        <w:t>.</w:t>
+      </w:r>
+    </w:p>
+    <w:p>
+      <w:pPr>
+        <w:pStyle w:val="NormalWeb"/>
+      </w:pPr>
+      <w:r>
+        <w:rPr>
+          <w:b/>
+          <w:bCs/>
+        </w:rPr>
+        <w:t>Thuật toán bằng chữ (Pseudocode):</w:t>
+      </w:r>
+    </w:p>
+    <w:p>
+      <w:pPr>
+        <w:pStyle w:val="NormalWeb"/>
+        <w:numPr>
+          <w:ilvl w:val="0"/>
+          <w:numId w:val="10"/>
+        </w:numPr>
+      </w:pPr>
+      <w:r>
+        <w:t xml:space="preserve">Khởi tạo </w:t>
+      </w:r>
+      <w:r>
+        <w:rPr>
+          <w:rStyle w:val="HTMLCode"/>
+        </w:rPr>
+        <w:t>logged_plates = {}</w:t>
+      </w:r>
+      <w:r>
+        <w:t xml:space="preserve"> (lưu {Biển_</w:t>
+      </w:r>
+      <w:proofErr w:type="gramStart"/>
+      <w:r>
+        <w:t>số :</w:t>
+      </w:r>
+      <w:proofErr w:type="gramEnd"/>
+      <w:r>
+        <w:t xml:space="preserve"> Frame_đã_lưu_gần_nhất})</w:t>
+      </w:r>
+    </w:p>
+    <w:p>
+      <w:pPr>
+        <w:pStyle w:val="NormalWeb"/>
+        <w:numPr>
+          <w:ilvl w:val="0"/>
+          <w:numId w:val="10"/>
+        </w:numPr>
+      </w:pPr>
+      <w:r>
+        <w:t xml:space="preserve">Khởi tạo </w:t>
+      </w:r>
+      <w:r>
+        <w:rPr>
+          <w:rStyle w:val="HTMLCode"/>
+        </w:rPr>
+        <w:t>COOLDOWN_FRAMES = 9000</w:t>
+      </w:r>
+      <w:r>
+        <w:t xml:space="preserve"> (Tương đương 5 phút)</w:t>
+      </w:r>
+    </w:p>
+    <w:p>
+      <w:pPr>
+        <w:pStyle w:val="NormalWeb"/>
+        <w:numPr>
+          <w:ilvl w:val="0"/>
+          <w:numId w:val="10"/>
+        </w:numPr>
+      </w:pPr>
+      <w:r>
+        <w:t xml:space="preserve">Khi OCR chốt được một biển số (Ví dụ: </w:t>
+      </w:r>
+      <w:r>
+        <w:rPr>
+          <w:rStyle w:val="HTMLCode"/>
+        </w:rPr>
+        <w:t>plate_text = "30A12345"</w:t>
+      </w:r>
+      <w:r>
+        <w:t xml:space="preserve"> ở frame thứ </w:t>
+      </w:r>
+      <w:r>
+        <w:rPr>
+          <w:rStyle w:val="HTMLCode"/>
+        </w:rPr>
+        <w:t>current_frame</w:t>
+      </w:r>
+      <w:r>
+        <w:t>):</w:t>
+      </w:r>
+    </w:p>
+    <w:p>
+      <w:pPr>
+        <w:pStyle w:val="NormalWeb"/>
+        <w:numPr>
+          <w:ilvl w:val="1"/>
+          <w:numId w:val="10"/>
+        </w:numPr>
+      </w:pPr>
+      <w:r>
+        <w:rPr>
+          <w:b/>
+          <w:bCs/>
+        </w:rPr>
+        <w:t>Kiểm tra 1:</w:t>
+      </w:r>
+      <w:r>
+        <w:t xml:space="preserve"> Biển số này CHƯA từng xuất hiện trong </w:t>
+      </w:r>
+      <w:r>
+        <w:rPr>
+          <w:rStyle w:val="HTMLCode"/>
+        </w:rPr>
+        <w:t>logged_plates</w:t>
+      </w:r>
+      <w:r>
+        <w:t xml:space="preserve">? </w:t>
+      </w:r>
+      <w:r>
+        <w:rPr>
+          <w:rFonts w:ascii="Segoe UI Emoji" w:hAnsi="Segoe UI Emoji" w:cs="Segoe UI Emoji"/>
+        </w:rPr>
+        <w:t>👉</w:t>
+      </w:r>
+      <w:r>
+        <w:t xml:space="preserve"> </w:t>
+      </w:r>
+      <w:r>
+        <w:rPr>
+          <w:b/>
+          <w:bCs/>
+        </w:rPr>
+        <w:t>Lưu ảnh ngay.</w:t>
+      </w:r>
+      <w:r>
+        <w:t xml:space="preserve"> Ghi vào file Excel/CSV (Nhật ký ra vào). </w:t>
+      </w:r>
+      <w:r>
+        <w:rPr>
+          <w:rFonts w:ascii="Segoe UI Emoji" w:hAnsi="Segoe UI Emoji" w:cs="Segoe UI Emoji"/>
+        </w:rPr>
+        <w:t>👉</w:t>
+      </w:r>
+      <w:r>
+        <w:t xml:space="preserve"> Cập nhật: </w:t>
+      </w:r>
+      <w:r>
+        <w:rPr>
+          <w:rStyle w:val="HTMLCode"/>
+        </w:rPr>
+        <w:t>logged_plates["30A12345"] = current_frame</w:t>
+      </w:r>
+    </w:p>
+    <w:p>
+      <w:pPr>
+        <w:pStyle w:val="NormalWeb"/>
+        <w:numPr>
+          <w:ilvl w:val="1"/>
+          <w:numId w:val="10"/>
+        </w:numPr>
+      </w:pPr>
+      <w:r>
+        <w:rPr>
+          <w:b/>
+          <w:bCs/>
+        </w:rPr>
+        <w:t>Kiểm tra 2:</w:t>
+      </w:r>
+      <w:r>
+        <w:t xml:space="preserve"> Biển số CÓ TRONG </w:t>
+      </w:r>
+      <w:r>
+        <w:rPr>
+          <w:rStyle w:val="HTMLCode"/>
+        </w:rPr>
+        <w:t>logged_plates</w:t>
+      </w:r>
+      <w:r>
+        <w:t xml:space="preserve"> rồi, ta xét tiếp: Tính khoảng cách: </w:t>
+      </w:r>
+      <w:r>
+        <w:rPr>
+          <w:rStyle w:val="HTMLCode"/>
+        </w:rPr>
+        <w:t>current_frame - logged_plates["30A12345"]</w:t>
+      </w:r>
+    </w:p>
+    <w:p>
+      <w:pPr>
+        <w:pStyle w:val="NormalWeb"/>
+        <w:numPr>
+          <w:ilvl w:val="2"/>
+          <w:numId w:val="10"/>
+        </w:numPr>
+      </w:pPr>
+      <w:r>
+        <w:t xml:space="preserve">Nếu </w:t>
+      </w:r>
+      <w:r>
+        <w:rPr>
+          <w:rStyle w:val="HTMLCode"/>
+        </w:rPr>
+        <w:t>khoảng cách &gt; COOLDOWN_FRAMES</w:t>
+      </w:r>
+      <w:r>
+        <w:t xml:space="preserve"> (Đã qua 5 phút): </w:t>
+      </w:r>
+      <w:r>
+        <w:rPr>
+          <w:rFonts w:ascii="Segoe UI Emoji" w:hAnsi="Segoe UI Emoji" w:cs="Segoe UI Emoji"/>
+        </w:rPr>
+        <w:t>👉</w:t>
+      </w:r>
+      <w:r>
+        <w:t xml:space="preserve"> Khẳng định đây là lượt xe mới quay lại. </w:t>
+      </w:r>
+      <w:r>
+        <w:rPr>
+          <w:b/>
+          <w:bCs/>
+        </w:rPr>
+        <w:t>Lưu ảnh tiếp.</w:t>
+      </w:r>
+      <w:r>
+        <w:t xml:space="preserve"> </w:t>
+      </w:r>
+      <w:r>
+        <w:rPr>
+          <w:rFonts w:ascii="Segoe UI Emoji" w:hAnsi="Segoe UI Emoji" w:cs="Segoe UI Emoji"/>
+        </w:rPr>
+        <w:t>👉</w:t>
+      </w:r>
+      <w:r>
+        <w:t xml:space="preserve"> Cập nhật lại: </w:t>
+      </w:r>
+      <w:r>
+        <w:rPr>
+          <w:rStyle w:val="HTMLCode"/>
+        </w:rPr>
+        <w:t>logged_plates["30A12345"] = current_frame</w:t>
+      </w:r>
+    </w:p>
+    <w:p>
+      <w:pPr>
+        <w:pStyle w:val="NormalWeb"/>
+        <w:numPr>
+          <w:ilvl w:val="2"/>
+          <w:numId w:val="10"/>
+        </w:numPr>
+      </w:pPr>
+      <w:r>
+        <w:t xml:space="preserve">Nếu </w:t>
+      </w:r>
+      <w:r>
+        <w:rPr>
+          <w:rStyle w:val="HTMLCode"/>
+        </w:rPr>
+        <w:t>khoảng cách &lt;= COOLDOWN_FRAMES</w:t>
+      </w:r>
+      <w:r>
+        <w:t xml:space="preserve"> (Chưa qua 5 phút): </w:t>
+      </w:r>
+      <w:r>
+        <w:rPr>
+          <w:rFonts w:ascii="Segoe UI Emoji" w:hAnsi="Segoe UI Emoji" w:cs="Segoe UI Emoji"/>
+        </w:rPr>
+        <w:t>👉</w:t>
+      </w:r>
+      <w:r>
+        <w:t xml:space="preserve"> Xe vẫn loanh quanh ở đó, </w:t>
+      </w:r>
+      <w:r>
+        <w:rPr>
+          <w:b/>
+          <w:bCs/>
+        </w:rPr>
+        <w:t>Bỏ qua không lưu gì cả</w:t>
+      </w:r>
+      <w:r>
+        <w:t xml:space="preserve"> để tránh rác ổ cứng.</w:t>
+      </w:r>
+    </w:p>
+    <w:p>
+      <w:pPr>
+        <w:rPr>
+          <w:rFonts w:ascii="Times New Roman" w:hAnsi="Times New Roman" w:cs="Times New Roman"/>
+          <w:sz w:val="26"/>
+          <w:szCs w:val="26"/>
+        </w:rPr>
+      </w:pPr>
+    </w:p>
     <w:sectPr>
       <w:pgSz w:w="12240" w:h="15840"/>
       <w:pgMar w:top="1440" w:right="1440" w:bottom="1440" w:left="1440" w:header="720" w:footer="720" w:gutter="0"/>
@@ -905,6 +2073,155 @@
     </w:lvl>
   </w:abstractNum>
   <w:abstractNum w:abstractNumId="1" w15:restartNumberingAfterBreak="0">
+    <w:nsid w:val="0DE663A3"/>
+    <w:multiLevelType w:val="multilevel"/>
+    <w:tmpl w:val="56740158"/>
+    <w:lvl w:ilvl="0">
+      <w:start w:val="1"/>
+      <w:numFmt w:val="bullet"/>
+      <w:lvlText w:val=""/>
+      <w:lvlJc w:val="left"/>
+      <w:pPr>
+        <w:tabs>
+          <w:tab w:val="num" w:pos="720"/>
+        </w:tabs>
+        <w:ind w:left="720" w:hanging="360"/>
+      </w:pPr>
+      <w:rPr>
+        <w:rFonts w:ascii="Symbol" w:hAnsi="Symbol" w:hint="default"/>
+        <w:sz w:val="20"/>
+      </w:rPr>
+    </w:lvl>
+    <w:lvl w:ilvl="1">
+      <w:start w:val="1"/>
+      <w:numFmt w:val="bullet"/>
+      <w:lvlText w:val="o"/>
+      <w:lvlJc w:val="left"/>
+      <w:pPr>
+        <w:tabs>
+          <w:tab w:val="num" w:pos="1440"/>
+        </w:tabs>
+        <w:ind w:left="1440" w:hanging="360"/>
+      </w:pPr>
+      <w:rPr>
+        <w:rFonts w:ascii="Courier New" w:hAnsi="Courier New" w:hint="default"/>
+        <w:sz w:val="20"/>
+      </w:rPr>
+    </w:lvl>
+    <w:lvl w:ilvl="2" w:tentative="1">
+      <w:start w:val="1"/>
+      <w:numFmt w:val="bullet"/>
+      <w:lvlText w:val=""/>
+      <w:lvlJc w:val="left"/>
+      <w:pPr>
+        <w:tabs>
+          <w:tab w:val="num" w:pos="2160"/>
+        </w:tabs>
+        <w:ind w:left="2160" w:hanging="360"/>
+      </w:pPr>
+      <w:rPr>
+        <w:rFonts w:ascii="Wingdings" w:hAnsi="Wingdings" w:hint="default"/>
+        <w:sz w:val="20"/>
+      </w:rPr>
+    </w:lvl>
+    <w:lvl w:ilvl="3" w:tentative="1">
+      <w:start w:val="1"/>
+      <w:numFmt w:val="bullet"/>
+      <w:lvlText w:val=""/>
+      <w:lvlJc w:val="left"/>
+      <w:pPr>
+        <w:tabs>
+          <w:tab w:val="num" w:pos="2880"/>
+        </w:tabs>
+        <w:ind w:left="2880" w:hanging="360"/>
+      </w:pPr>
+      <w:rPr>
+        <w:rFonts w:ascii="Wingdings" w:hAnsi="Wingdings" w:hint="default"/>
+        <w:sz w:val="20"/>
+      </w:rPr>
+    </w:lvl>
+    <w:lvl w:ilvl="4" w:tentative="1">
+      <w:start w:val="1"/>
+      <w:numFmt w:val="bullet"/>
+      <w:lvlText w:val=""/>
+      <w:lvlJc w:val="left"/>
+      <w:pPr>
+        <w:tabs>
+          <w:tab w:val="num" w:pos="3600"/>
+        </w:tabs>
+        <w:ind w:left="3600" w:hanging="360"/>
+      </w:pPr>
+      <w:rPr>
+        <w:rFonts w:ascii="Wingdings" w:hAnsi="Wingdings" w:hint="default"/>
+        <w:sz w:val="20"/>
+      </w:rPr>
+    </w:lvl>
+    <w:lvl w:ilvl="5" w:tentative="1">
+      <w:start w:val="1"/>
+      <w:numFmt w:val="bullet"/>
+      <w:lvlText w:val=""/>
+      <w:lvlJc w:val="left"/>
+      <w:pPr>
+        <w:tabs>
+          <w:tab w:val="num" w:pos="4320"/>
+        </w:tabs>
+        <w:ind w:left="4320" w:hanging="360"/>
+      </w:pPr>
+      <w:rPr>
+        <w:rFonts w:ascii="Wingdings" w:hAnsi="Wingdings" w:hint="default"/>
+        <w:sz w:val="20"/>
+      </w:rPr>
+    </w:lvl>
+    <w:lvl w:ilvl="6" w:tentative="1">
+      <w:start w:val="1"/>
+      <w:numFmt w:val="bullet"/>
+      <w:lvlText w:val=""/>
+      <w:lvlJc w:val="left"/>
+      <w:pPr>
+        <w:tabs>
+          <w:tab w:val="num" w:pos="5040"/>
+        </w:tabs>
+        <w:ind w:left="5040" w:hanging="360"/>
+      </w:pPr>
+      <w:rPr>
+        <w:rFonts w:ascii="Wingdings" w:hAnsi="Wingdings" w:hint="default"/>
+        <w:sz w:val="20"/>
+      </w:rPr>
+    </w:lvl>
+    <w:lvl w:ilvl="7" w:tentative="1">
+      <w:start w:val="1"/>
+      <w:numFmt w:val="bullet"/>
+      <w:lvlText w:val=""/>
+      <w:lvlJc w:val="left"/>
+      <w:pPr>
+        <w:tabs>
+          <w:tab w:val="num" w:pos="5760"/>
+        </w:tabs>
+        <w:ind w:left="5760" w:hanging="360"/>
+      </w:pPr>
+      <w:rPr>
+        <w:rFonts w:ascii="Wingdings" w:hAnsi="Wingdings" w:hint="default"/>
+        <w:sz w:val="20"/>
+      </w:rPr>
+    </w:lvl>
+    <w:lvl w:ilvl="8" w:tentative="1">
+      <w:start w:val="1"/>
+      <w:numFmt w:val="bullet"/>
+      <w:lvlText w:val=""/>
+      <w:lvlJc w:val="left"/>
+      <w:pPr>
+        <w:tabs>
+          <w:tab w:val="num" w:pos="6480"/>
+        </w:tabs>
+        <w:ind w:left="6480" w:hanging="360"/>
+      </w:pPr>
+      <w:rPr>
+        <w:rFonts w:ascii="Wingdings" w:hAnsi="Wingdings" w:hint="default"/>
+        <w:sz w:val="20"/>
+      </w:rPr>
+    </w:lvl>
+  </w:abstractNum>
+  <w:abstractNum w:abstractNumId="2" w15:restartNumberingAfterBreak="0">
     <w:nsid w:val="11D5560A"/>
     <w:multiLevelType w:val="multilevel"/>
     <w:tmpl w:val="EA685E94"/>
@@ -1053,7 +2370,156 @@
       </w:rPr>
     </w:lvl>
   </w:abstractNum>
-  <w:abstractNum w:abstractNumId="2" w15:restartNumberingAfterBreak="0">
+  <w:abstractNum w:abstractNumId="3" w15:restartNumberingAfterBreak="0">
+    <w:nsid w:val="30252579"/>
+    <w:multiLevelType w:val="multilevel"/>
+    <w:tmpl w:val="97367C46"/>
+    <w:lvl w:ilvl="0">
+      <w:start w:val="1"/>
+      <w:numFmt w:val="bullet"/>
+      <w:lvlText w:val=""/>
+      <w:lvlJc w:val="left"/>
+      <w:pPr>
+        <w:tabs>
+          <w:tab w:val="num" w:pos="720"/>
+        </w:tabs>
+        <w:ind w:left="720" w:hanging="360"/>
+      </w:pPr>
+      <w:rPr>
+        <w:rFonts w:ascii="Symbol" w:hAnsi="Symbol" w:hint="default"/>
+        <w:sz w:val="20"/>
+      </w:rPr>
+    </w:lvl>
+    <w:lvl w:ilvl="1">
+      <w:start w:val="1"/>
+      <w:numFmt w:val="bullet"/>
+      <w:lvlText w:val="o"/>
+      <w:lvlJc w:val="left"/>
+      <w:pPr>
+        <w:tabs>
+          <w:tab w:val="num" w:pos="1440"/>
+        </w:tabs>
+        <w:ind w:left="1440" w:hanging="360"/>
+      </w:pPr>
+      <w:rPr>
+        <w:rFonts w:ascii="Courier New" w:hAnsi="Courier New" w:hint="default"/>
+        <w:sz w:val="20"/>
+      </w:rPr>
+    </w:lvl>
+    <w:lvl w:ilvl="2" w:tentative="1">
+      <w:start w:val="1"/>
+      <w:numFmt w:val="bullet"/>
+      <w:lvlText w:val=""/>
+      <w:lvlJc w:val="left"/>
+      <w:pPr>
+        <w:tabs>
+          <w:tab w:val="num" w:pos="2160"/>
+        </w:tabs>
+        <w:ind w:left="2160" w:hanging="360"/>
+      </w:pPr>
+      <w:rPr>
+        <w:rFonts w:ascii="Wingdings" w:hAnsi="Wingdings" w:hint="default"/>
+        <w:sz w:val="20"/>
+      </w:rPr>
+    </w:lvl>
+    <w:lvl w:ilvl="3" w:tentative="1">
+      <w:start w:val="1"/>
+      <w:numFmt w:val="bullet"/>
+      <w:lvlText w:val=""/>
+      <w:lvlJc w:val="left"/>
+      <w:pPr>
+        <w:tabs>
+          <w:tab w:val="num" w:pos="2880"/>
+        </w:tabs>
+        <w:ind w:left="2880" w:hanging="360"/>
+      </w:pPr>
+      <w:rPr>
+        <w:rFonts w:ascii="Wingdings" w:hAnsi="Wingdings" w:hint="default"/>
+        <w:sz w:val="20"/>
+      </w:rPr>
+    </w:lvl>
+    <w:lvl w:ilvl="4" w:tentative="1">
+      <w:start w:val="1"/>
+      <w:numFmt w:val="bullet"/>
+      <w:lvlText w:val=""/>
+      <w:lvlJc w:val="left"/>
+      <w:pPr>
+        <w:tabs>
+          <w:tab w:val="num" w:pos="3600"/>
+        </w:tabs>
+        <w:ind w:left="3600" w:hanging="360"/>
+      </w:pPr>
+      <w:rPr>
+        <w:rFonts w:ascii="Wingdings" w:hAnsi="Wingdings" w:hint="default"/>
+        <w:sz w:val="20"/>
+      </w:rPr>
+    </w:lvl>
+    <w:lvl w:ilvl="5" w:tentative="1">
+      <w:start w:val="1"/>
+      <w:numFmt w:val="bullet"/>
+      <w:lvlText w:val=""/>
+      <w:lvlJc w:val="left"/>
+      <w:pPr>
+        <w:tabs>
+          <w:tab w:val="num" w:pos="4320"/>
+        </w:tabs>
+        <w:ind w:left="4320" w:hanging="360"/>
+      </w:pPr>
+      <w:rPr>
+        <w:rFonts w:ascii="Wingdings" w:hAnsi="Wingdings" w:hint="default"/>
+        <w:sz w:val="20"/>
+      </w:rPr>
+    </w:lvl>
+    <w:lvl w:ilvl="6" w:tentative="1">
+      <w:start w:val="1"/>
+      <w:numFmt w:val="bullet"/>
+      <w:lvlText w:val=""/>
+      <w:lvlJc w:val="left"/>
+      <w:pPr>
+        <w:tabs>
+          <w:tab w:val="num" w:pos="5040"/>
+        </w:tabs>
+        <w:ind w:left="5040" w:hanging="360"/>
+      </w:pPr>
+      <w:rPr>
+        <w:rFonts w:ascii="Wingdings" w:hAnsi="Wingdings" w:hint="default"/>
+        <w:sz w:val="20"/>
+      </w:rPr>
+    </w:lvl>
+    <w:lvl w:ilvl="7" w:tentative="1">
+      <w:start w:val="1"/>
+      <w:numFmt w:val="bullet"/>
+      <w:lvlText w:val=""/>
+      <w:lvlJc w:val="left"/>
+      <w:pPr>
+        <w:tabs>
+          <w:tab w:val="num" w:pos="5760"/>
+        </w:tabs>
+        <w:ind w:left="5760" w:hanging="360"/>
+      </w:pPr>
+      <w:rPr>
+        <w:rFonts w:ascii="Wingdings" w:hAnsi="Wingdings" w:hint="default"/>
+        <w:sz w:val="20"/>
+      </w:rPr>
+    </w:lvl>
+    <w:lvl w:ilvl="8" w:tentative="1">
+      <w:start w:val="1"/>
+      <w:numFmt w:val="bullet"/>
+      <w:lvlText w:val=""/>
+      <w:lvlJc w:val="left"/>
+      <w:pPr>
+        <w:tabs>
+          <w:tab w:val="num" w:pos="6480"/>
+        </w:tabs>
+        <w:ind w:left="6480" w:hanging="360"/>
+      </w:pPr>
+      <w:rPr>
+        <w:rFonts w:ascii="Wingdings" w:hAnsi="Wingdings" w:hint="default"/>
+        <w:sz w:val="20"/>
+      </w:rPr>
+    </w:lvl>
+  </w:abstractNum>
+  <w:abstractNum w:abstractNumId="4" w15:restartNumberingAfterBreak="0">
     <w:nsid w:val="36324B99"/>
     <w:multiLevelType w:val="multilevel"/>
     <w:tmpl w:val="E4BA58A8"/>
@@ -1202,7 +2668,128 @@
       </w:rPr>
     </w:lvl>
   </w:abstractNum>
-  <w:abstractNum w:abstractNumId="3" w15:restartNumberingAfterBreak="0">
+  <w:abstractNum w:abstractNumId="5" w15:restartNumberingAfterBreak="0">
+    <w:nsid w:val="44A41978"/>
+    <w:multiLevelType w:val="multilevel"/>
+    <w:tmpl w:val="93EC5AC6"/>
+    <w:lvl w:ilvl="0">
+      <w:start w:val="1"/>
+      <w:numFmt w:val="decimal"/>
+      <w:lvlText w:val="%1."/>
+      <w:lvlJc w:val="left"/>
+      <w:pPr>
+        <w:tabs>
+          <w:tab w:val="num" w:pos="720"/>
+        </w:tabs>
+        <w:ind w:left="720" w:hanging="360"/>
+      </w:pPr>
+    </w:lvl>
+    <w:lvl w:ilvl="1">
+      <w:start w:val="1"/>
+      <w:numFmt w:val="bullet"/>
+      <w:lvlText w:val="o"/>
+      <w:lvlJc w:val="left"/>
+      <w:pPr>
+        <w:tabs>
+          <w:tab w:val="num" w:pos="1440"/>
+        </w:tabs>
+        <w:ind w:left="1440" w:hanging="360"/>
+      </w:pPr>
+      <w:rPr>
+        <w:rFonts w:ascii="Courier New" w:hAnsi="Courier New" w:hint="default"/>
+        <w:sz w:val="20"/>
+      </w:rPr>
+    </w:lvl>
+    <w:lvl w:ilvl="2">
+      <w:start w:val="1"/>
+      <w:numFmt w:val="bullet"/>
+      <w:lvlText w:val=""/>
+      <w:lvlJc w:val="left"/>
+      <w:pPr>
+        <w:tabs>
+          <w:tab w:val="num" w:pos="2160"/>
+        </w:tabs>
+        <w:ind w:left="2160" w:hanging="360"/>
+      </w:pPr>
+      <w:rPr>
+        <w:rFonts w:ascii="Wingdings" w:hAnsi="Wingdings" w:hint="default"/>
+        <w:sz w:val="20"/>
+      </w:rPr>
+    </w:lvl>
+    <w:lvl w:ilvl="3" w:tentative="1">
+      <w:start w:val="1"/>
+      <w:numFmt w:val="decimal"/>
+      <w:lvlText w:val="%4."/>
+      <w:lvlJc w:val="left"/>
+      <w:pPr>
+        <w:tabs>
+          <w:tab w:val="num" w:pos="2880"/>
+        </w:tabs>
+        <w:ind w:left="2880" w:hanging="360"/>
+      </w:pPr>
+    </w:lvl>
+    <w:lvl w:ilvl="4" w:tentative="1">
+      <w:start w:val="1"/>
+      <w:numFmt w:val="decimal"/>
+      <w:lvlText w:val="%5."/>
+      <w:lvlJc w:val="left"/>
+      <w:pPr>
+        <w:tabs>
+          <w:tab w:val="num" w:pos="3600"/>
+        </w:tabs>
+        <w:ind w:left="3600" w:hanging="360"/>
+      </w:pPr>
+    </w:lvl>
+    <w:lvl w:ilvl="5" w:tentative="1">
+      <w:start w:val="1"/>
+      <w:numFmt w:val="decimal"/>
+      <w:lvlText w:val="%6."/>
+      <w:lvlJc w:val="left"/>
+      <w:pPr>
+        <w:tabs>
+          <w:tab w:val="num" w:pos="4320"/>
+        </w:tabs>
+        <w:ind w:left="4320" w:hanging="360"/>
+      </w:pPr>
+    </w:lvl>
+    <w:lvl w:ilvl="6" w:tentative="1">
+      <w:start w:val="1"/>
+      <w:numFmt w:val="decimal"/>
+      <w:lvlText w:val="%7."/>
+      <w:lvlJc w:val="left"/>
+      <w:pPr>
+        <w:tabs>
+          <w:tab w:val="num" w:pos="5040"/>
+        </w:tabs>
+        <w:ind w:left="5040" w:hanging="360"/>
+      </w:pPr>
+    </w:lvl>
+    <w:lvl w:ilvl="7" w:tentative="1">
+      <w:start w:val="1"/>
+      <w:numFmt w:val="decimal"/>
+      <w:lvlText w:val="%8."/>
+      <w:lvlJc w:val="left"/>
+      <w:pPr>
+        <w:tabs>
+          <w:tab w:val="num" w:pos="5760"/>
+        </w:tabs>
+        <w:ind w:left="5760" w:hanging="360"/>
+      </w:pPr>
+    </w:lvl>
+    <w:lvl w:ilvl="8" w:tentative="1">
+      <w:start w:val="1"/>
+      <w:numFmt w:val="decimal"/>
+      <w:lvlText w:val="%9."/>
+      <w:lvlJc w:val="left"/>
+      <w:pPr>
+        <w:tabs>
+          <w:tab w:val="num" w:pos="6480"/>
+        </w:tabs>
+        <w:ind w:left="6480" w:hanging="360"/>
+      </w:pPr>
+    </w:lvl>
+  </w:abstractNum>
+  <w:abstractNum w:abstractNumId="6" w15:restartNumberingAfterBreak="0">
     <w:nsid w:val="56EE2A5B"/>
     <w:multiLevelType w:val="multilevel"/>
     <w:tmpl w:val="2A7AD2D0"/>
@@ -1351,17 +2938,482 @@
       </w:rPr>
     </w:lvl>
   </w:abstractNum>
+  <w:abstractNum w:abstractNumId="7" w15:restartNumberingAfterBreak="0">
+    <w:nsid w:val="67F023ED"/>
+    <w:multiLevelType w:val="multilevel"/>
+    <w:tmpl w:val="D9A05BF0"/>
+    <w:lvl w:ilvl="0">
+      <w:start w:val="1"/>
+      <w:numFmt w:val="bullet"/>
+      <w:lvlText w:val=""/>
+      <w:lvlJc w:val="left"/>
+      <w:pPr>
+        <w:tabs>
+          <w:tab w:val="num" w:pos="720"/>
+        </w:tabs>
+        <w:ind w:left="720" w:hanging="360"/>
+      </w:pPr>
+      <w:rPr>
+        <w:rFonts w:ascii="Symbol" w:hAnsi="Symbol" w:hint="default"/>
+        <w:sz w:val="20"/>
+      </w:rPr>
+    </w:lvl>
+    <w:lvl w:ilvl="1">
+      <w:start w:val="1"/>
+      <w:numFmt w:val="bullet"/>
+      <w:lvlText w:val="o"/>
+      <w:lvlJc w:val="left"/>
+      <w:pPr>
+        <w:tabs>
+          <w:tab w:val="num" w:pos="1440"/>
+        </w:tabs>
+        <w:ind w:left="1440" w:hanging="360"/>
+      </w:pPr>
+      <w:rPr>
+        <w:rFonts w:ascii="Courier New" w:hAnsi="Courier New" w:hint="default"/>
+        <w:sz w:val="20"/>
+      </w:rPr>
+    </w:lvl>
+    <w:lvl w:ilvl="2" w:tentative="1">
+      <w:start w:val="1"/>
+      <w:numFmt w:val="bullet"/>
+      <w:lvlText w:val=""/>
+      <w:lvlJc w:val="left"/>
+      <w:pPr>
+        <w:tabs>
+          <w:tab w:val="num" w:pos="2160"/>
+        </w:tabs>
+        <w:ind w:left="2160" w:hanging="360"/>
+      </w:pPr>
+      <w:rPr>
+        <w:rFonts w:ascii="Wingdings" w:hAnsi="Wingdings" w:hint="default"/>
+        <w:sz w:val="20"/>
+      </w:rPr>
+    </w:lvl>
+    <w:lvl w:ilvl="3" w:tentative="1">
+      <w:start w:val="1"/>
+      <w:numFmt w:val="bullet"/>
+      <w:lvlText w:val=""/>
+      <w:lvlJc w:val="left"/>
+      <w:pPr>
+        <w:tabs>
+          <w:tab w:val="num" w:pos="2880"/>
+        </w:tabs>
+        <w:ind w:left="2880" w:hanging="360"/>
+      </w:pPr>
+      <w:rPr>
+        <w:rFonts w:ascii="Wingdings" w:hAnsi="Wingdings" w:hint="default"/>
+        <w:sz w:val="20"/>
+      </w:rPr>
+    </w:lvl>
+    <w:lvl w:ilvl="4" w:tentative="1">
+      <w:start w:val="1"/>
+      <w:numFmt w:val="bullet"/>
+      <w:lvlText w:val=""/>
+      <w:lvlJc w:val="left"/>
+      <w:pPr>
+        <w:tabs>
+          <w:tab w:val="num" w:pos="3600"/>
+        </w:tabs>
+        <w:ind w:left="3600" w:hanging="360"/>
+      </w:pPr>
+      <w:rPr>
+        <w:rFonts w:ascii="Wingdings" w:hAnsi="Wingdings" w:hint="default"/>
+        <w:sz w:val="20"/>
+      </w:rPr>
+    </w:lvl>
+    <w:lvl w:ilvl="5" w:tentative="1">
+      <w:start w:val="1"/>
+      <w:numFmt w:val="bullet"/>
+      <w:lvlText w:val=""/>
+      <w:lvlJc w:val="left"/>
+      <w:pPr>
+        <w:tabs>
+          <w:tab w:val="num" w:pos="4320"/>
+        </w:tabs>
+        <w:ind w:left="4320" w:hanging="360"/>
+      </w:pPr>
+      <w:rPr>
+        <w:rFonts w:ascii="Wingdings" w:hAnsi="Wingdings" w:hint="default"/>
+        <w:sz w:val="20"/>
+      </w:rPr>
+    </w:lvl>
+    <w:lvl w:ilvl="6" w:tentative="1">
+      <w:start w:val="1"/>
+      <w:numFmt w:val="bullet"/>
+      <w:lvlText w:val=""/>
+      <w:lvlJc w:val="left"/>
+      <w:pPr>
+        <w:tabs>
+          <w:tab w:val="num" w:pos="5040"/>
+        </w:tabs>
+        <w:ind w:left="5040" w:hanging="360"/>
+      </w:pPr>
+      <w:rPr>
+        <w:rFonts w:ascii="Wingdings" w:hAnsi="Wingdings" w:hint="default"/>
+        <w:sz w:val="20"/>
+      </w:rPr>
+    </w:lvl>
+    <w:lvl w:ilvl="7" w:tentative="1">
+      <w:start w:val="1"/>
+      <w:numFmt w:val="bullet"/>
+      <w:lvlText w:val=""/>
+      <w:lvlJc w:val="left"/>
+      <w:pPr>
+        <w:tabs>
+          <w:tab w:val="num" w:pos="5760"/>
+        </w:tabs>
+        <w:ind w:left="5760" w:hanging="360"/>
+      </w:pPr>
+      <w:rPr>
+        <w:rFonts w:ascii="Wingdings" w:hAnsi="Wingdings" w:hint="default"/>
+        <w:sz w:val="20"/>
+      </w:rPr>
+    </w:lvl>
+    <w:lvl w:ilvl="8" w:tentative="1">
+      <w:start w:val="1"/>
+      <w:numFmt w:val="bullet"/>
+      <w:lvlText w:val=""/>
+      <w:lvlJc w:val="left"/>
+      <w:pPr>
+        <w:tabs>
+          <w:tab w:val="num" w:pos="6480"/>
+        </w:tabs>
+        <w:ind w:left="6480" w:hanging="360"/>
+      </w:pPr>
+      <w:rPr>
+        <w:rFonts w:ascii="Wingdings" w:hAnsi="Wingdings" w:hint="default"/>
+        <w:sz w:val="20"/>
+      </w:rPr>
+    </w:lvl>
+  </w:abstractNum>
+  <w:abstractNum w:abstractNumId="8" w15:restartNumberingAfterBreak="0">
+    <w:nsid w:val="72A02551"/>
+    <w:multiLevelType w:val="multilevel"/>
+    <w:tmpl w:val="B86EFBC0"/>
+    <w:lvl w:ilvl="0">
+      <w:start w:val="1"/>
+      <w:numFmt w:val="bullet"/>
+      <w:lvlText w:val=""/>
+      <w:lvlJc w:val="left"/>
+      <w:pPr>
+        <w:tabs>
+          <w:tab w:val="num" w:pos="720"/>
+        </w:tabs>
+        <w:ind w:left="720" w:hanging="360"/>
+      </w:pPr>
+      <w:rPr>
+        <w:rFonts w:ascii="Symbol" w:hAnsi="Symbol" w:hint="default"/>
+        <w:sz w:val="20"/>
+      </w:rPr>
+    </w:lvl>
+    <w:lvl w:ilvl="1">
+      <w:start w:val="1"/>
+      <w:numFmt w:val="bullet"/>
+      <w:lvlText w:val="o"/>
+      <w:lvlJc w:val="left"/>
+      <w:pPr>
+        <w:tabs>
+          <w:tab w:val="num" w:pos="1440"/>
+        </w:tabs>
+        <w:ind w:left="1440" w:hanging="360"/>
+      </w:pPr>
+      <w:rPr>
+        <w:rFonts w:ascii="Courier New" w:hAnsi="Courier New" w:hint="default"/>
+        <w:sz w:val="20"/>
+      </w:rPr>
+    </w:lvl>
+    <w:lvl w:ilvl="2" w:tentative="1">
+      <w:start w:val="1"/>
+      <w:numFmt w:val="bullet"/>
+      <w:lvlText w:val=""/>
+      <w:lvlJc w:val="left"/>
+      <w:pPr>
+        <w:tabs>
+          <w:tab w:val="num" w:pos="2160"/>
+        </w:tabs>
+        <w:ind w:left="2160" w:hanging="360"/>
+      </w:pPr>
+      <w:rPr>
+        <w:rFonts w:ascii="Wingdings" w:hAnsi="Wingdings" w:hint="default"/>
+        <w:sz w:val="20"/>
+      </w:rPr>
+    </w:lvl>
+    <w:lvl w:ilvl="3" w:tentative="1">
+      <w:start w:val="1"/>
+      <w:numFmt w:val="bullet"/>
+      <w:lvlText w:val=""/>
+      <w:lvlJc w:val="left"/>
+      <w:pPr>
+        <w:tabs>
+          <w:tab w:val="num" w:pos="2880"/>
+        </w:tabs>
+        <w:ind w:left="2880" w:hanging="360"/>
+      </w:pPr>
+      <w:rPr>
+        <w:rFonts w:ascii="Wingdings" w:hAnsi="Wingdings" w:hint="default"/>
+        <w:sz w:val="20"/>
+      </w:rPr>
+    </w:lvl>
+    <w:lvl w:ilvl="4" w:tentative="1">
+      <w:start w:val="1"/>
+      <w:numFmt w:val="bullet"/>
+      <w:lvlText w:val=""/>
+      <w:lvlJc w:val="left"/>
+      <w:pPr>
+        <w:tabs>
+          <w:tab w:val="num" w:pos="3600"/>
+        </w:tabs>
+        <w:ind w:left="3600" w:hanging="360"/>
+      </w:pPr>
+      <w:rPr>
+        <w:rFonts w:ascii="Wingdings" w:hAnsi="Wingdings" w:hint="default"/>
+        <w:sz w:val="20"/>
+      </w:rPr>
+    </w:lvl>
+    <w:lvl w:ilvl="5" w:tentative="1">
+      <w:start w:val="1"/>
+      <w:numFmt w:val="bullet"/>
+      <w:lvlText w:val=""/>
+      <w:lvlJc w:val="left"/>
+      <w:pPr>
+        <w:tabs>
+          <w:tab w:val="num" w:pos="4320"/>
+        </w:tabs>
+        <w:ind w:left="4320" w:hanging="360"/>
+      </w:pPr>
+      <w:rPr>
+        <w:rFonts w:ascii="Wingdings" w:hAnsi="Wingdings" w:hint="default"/>
+        <w:sz w:val="20"/>
+      </w:rPr>
+    </w:lvl>
+    <w:lvl w:ilvl="6" w:tentative="1">
+      <w:start w:val="1"/>
+      <w:numFmt w:val="bullet"/>
+      <w:lvlText w:val=""/>
+      <w:lvlJc w:val="left"/>
+      <w:pPr>
+        <w:tabs>
+          <w:tab w:val="num" w:pos="5040"/>
+        </w:tabs>
+        <w:ind w:left="5040" w:hanging="360"/>
+      </w:pPr>
+      <w:rPr>
+        <w:rFonts w:ascii="Wingdings" w:hAnsi="Wingdings" w:hint="default"/>
+        <w:sz w:val="20"/>
+      </w:rPr>
+    </w:lvl>
+    <w:lvl w:ilvl="7" w:tentative="1">
+      <w:start w:val="1"/>
+      <w:numFmt w:val="bullet"/>
+      <w:lvlText w:val=""/>
+      <w:lvlJc w:val="left"/>
+      <w:pPr>
+        <w:tabs>
+          <w:tab w:val="num" w:pos="5760"/>
+        </w:tabs>
+        <w:ind w:left="5760" w:hanging="360"/>
+      </w:pPr>
+      <w:rPr>
+        <w:rFonts w:ascii="Wingdings" w:hAnsi="Wingdings" w:hint="default"/>
+        <w:sz w:val="20"/>
+      </w:rPr>
+    </w:lvl>
+    <w:lvl w:ilvl="8" w:tentative="1">
+      <w:start w:val="1"/>
+      <w:numFmt w:val="bullet"/>
+      <w:lvlText w:val=""/>
+      <w:lvlJc w:val="left"/>
+      <w:pPr>
+        <w:tabs>
+          <w:tab w:val="num" w:pos="6480"/>
+        </w:tabs>
+        <w:ind w:left="6480" w:hanging="360"/>
+      </w:pPr>
+      <w:rPr>
+        <w:rFonts w:ascii="Wingdings" w:hAnsi="Wingdings" w:hint="default"/>
+        <w:sz w:val="20"/>
+      </w:rPr>
+    </w:lvl>
+  </w:abstractNum>
+  <w:abstractNum w:abstractNumId="9" w15:restartNumberingAfterBreak="0">
+    <w:nsid w:val="79527FA4"/>
+    <w:multiLevelType w:val="multilevel"/>
+    <w:tmpl w:val="166A4BA2"/>
+    <w:lvl w:ilvl="0">
+      <w:start w:val="1"/>
+      <w:numFmt w:val="bullet"/>
+      <w:lvlText w:val=""/>
+      <w:lvlJc w:val="left"/>
+      <w:pPr>
+        <w:tabs>
+          <w:tab w:val="num" w:pos="720"/>
+        </w:tabs>
+        <w:ind w:left="720" w:hanging="360"/>
+      </w:pPr>
+      <w:rPr>
+        <w:rFonts w:ascii="Symbol" w:hAnsi="Symbol" w:hint="default"/>
+        <w:sz w:val="20"/>
+      </w:rPr>
+    </w:lvl>
+    <w:lvl w:ilvl="1" w:tentative="1">
+      <w:start w:val="1"/>
+      <w:numFmt w:val="bullet"/>
+      <w:lvlText w:val="o"/>
+      <w:lvlJc w:val="left"/>
+      <w:pPr>
+        <w:tabs>
+          <w:tab w:val="num" w:pos="1440"/>
+        </w:tabs>
+        <w:ind w:left="1440" w:hanging="360"/>
+      </w:pPr>
+      <w:rPr>
+        <w:rFonts w:ascii="Courier New" w:hAnsi="Courier New" w:hint="default"/>
+        <w:sz w:val="20"/>
+      </w:rPr>
+    </w:lvl>
+    <w:lvl w:ilvl="2" w:tentative="1">
+      <w:start w:val="1"/>
+      <w:numFmt w:val="bullet"/>
+      <w:lvlText w:val=""/>
+      <w:lvlJc w:val="left"/>
+      <w:pPr>
+        <w:tabs>
+          <w:tab w:val="num" w:pos="2160"/>
+        </w:tabs>
+        <w:ind w:left="2160" w:hanging="360"/>
+      </w:pPr>
+      <w:rPr>
+        <w:rFonts w:ascii="Wingdings" w:hAnsi="Wingdings" w:hint="default"/>
+        <w:sz w:val="20"/>
+      </w:rPr>
+    </w:lvl>
+    <w:lvl w:ilvl="3" w:tentative="1">
+      <w:start w:val="1"/>
+      <w:numFmt w:val="bullet"/>
+      <w:lvlText w:val=""/>
+      <w:lvlJc w:val="left"/>
+      <w:pPr>
+        <w:tabs>
+          <w:tab w:val="num" w:pos="2880"/>
+        </w:tabs>
+        <w:ind w:left="2880" w:hanging="360"/>
+      </w:pPr>
+      <w:rPr>
+        <w:rFonts w:ascii="Wingdings" w:hAnsi="Wingdings" w:hint="default"/>
+        <w:sz w:val="20"/>
+      </w:rPr>
+    </w:lvl>
+    <w:lvl w:ilvl="4" w:tentative="1">
+      <w:start w:val="1"/>
+      <w:numFmt w:val="bullet"/>
+      <w:lvlText w:val=""/>
+      <w:lvlJc w:val="left"/>
+      <w:pPr>
+        <w:tabs>
+          <w:tab w:val="num" w:pos="3600"/>
+        </w:tabs>
+        <w:ind w:left="3600" w:hanging="360"/>
+      </w:pPr>
+      <w:rPr>
+        <w:rFonts w:ascii="Wingdings" w:hAnsi="Wingdings" w:hint="default"/>
+        <w:sz w:val="20"/>
+      </w:rPr>
+    </w:lvl>
+    <w:lvl w:ilvl="5" w:tentative="1">
+      <w:start w:val="1"/>
+      <w:numFmt w:val="bullet"/>
+      <w:lvlText w:val=""/>
+      <w:lvlJc w:val="left"/>
+      <w:pPr>
+        <w:tabs>
+          <w:tab w:val="num" w:pos="4320"/>
+        </w:tabs>
+        <w:ind w:left="4320" w:hanging="360"/>
+      </w:pPr>
+      <w:rPr>
+        <w:rFonts w:ascii="Wingdings" w:hAnsi="Wingdings" w:hint="default"/>
+        <w:sz w:val="20"/>
+      </w:rPr>
+    </w:lvl>
+    <w:lvl w:ilvl="6" w:tentative="1">
+      <w:start w:val="1"/>
+      <w:numFmt w:val="bullet"/>
+      <w:lvlText w:val=""/>
+      <w:lvlJc w:val="left"/>
+      <w:pPr>
+        <w:tabs>
+          <w:tab w:val="num" w:pos="5040"/>
+        </w:tabs>
+        <w:ind w:left="5040" w:hanging="360"/>
+      </w:pPr>
+      <w:rPr>
+        <w:rFonts w:ascii="Wingdings" w:hAnsi="Wingdings" w:hint="default"/>
+        <w:sz w:val="20"/>
+      </w:rPr>
+    </w:lvl>
+    <w:lvl w:ilvl="7" w:tentative="1">
+      <w:start w:val="1"/>
+      <w:numFmt w:val="bullet"/>
+      <w:lvlText w:val=""/>
+      <w:lvlJc w:val="left"/>
+      <w:pPr>
+        <w:tabs>
+          <w:tab w:val="num" w:pos="5760"/>
+        </w:tabs>
+        <w:ind w:left="5760" w:hanging="360"/>
+      </w:pPr>
+      <w:rPr>
+        <w:rFonts w:ascii="Wingdings" w:hAnsi="Wingdings" w:hint="default"/>
+        <w:sz w:val="20"/>
+      </w:rPr>
+    </w:lvl>
+    <w:lvl w:ilvl="8" w:tentative="1">
+      <w:start w:val="1"/>
+      <w:numFmt w:val="bullet"/>
+      <w:lvlText w:val=""/>
+      <w:lvlJc w:val="left"/>
+      <w:pPr>
+        <w:tabs>
+          <w:tab w:val="num" w:pos="6480"/>
+        </w:tabs>
+        <w:ind w:left="6480" w:hanging="360"/>
+      </w:pPr>
+      <w:rPr>
+        <w:rFonts w:ascii="Wingdings" w:hAnsi="Wingdings" w:hint="default"/>
+        <w:sz w:val="20"/>
+      </w:rPr>
+    </w:lvl>
+  </w:abstractNum>
   <w:num w:numId="1">
-    <w:abstractNumId w:val="2"/>
+    <w:abstractNumId w:val="4"/>
   </w:num>
   <w:num w:numId="2">
-    <w:abstractNumId w:val="3"/>
+    <w:abstractNumId w:val="6"/>
   </w:num>
   <w:num w:numId="3">
     <w:abstractNumId w:val="0"/>
   </w:num>
   <w:num w:numId="4">
+    <w:abstractNumId w:val="2"/>
+  </w:num>
+  <w:num w:numId="5">
+    <w:abstractNumId w:val="9"/>
+  </w:num>
+  <w:num w:numId="6">
     <w:abstractNumId w:val="1"/>
+  </w:num>
+  <w:num w:numId="7">
+    <w:abstractNumId w:val="7"/>
+  </w:num>
+  <w:num w:numId="8">
+    <w:abstractNumId w:val="3"/>
+  </w:num>
+  <w:num w:numId="9">
+    <w:abstractNumId w:val="8"/>
+  </w:num>
+  <w:num w:numId="10">
+    <w:abstractNumId w:val="5"/>
   </w:num>
 </w:numbering>
 </file>

</xml_diff>